<commit_message>
Actualizacion de documentacion mejora futura
</commit_message>
<xml_diff>
--- a/Pruebas/Proyecto  Respaldoa.docx
+++ b/Pruebas/Proyecto  Respaldoa.docx
@@ -238,7 +238,7 @@
           <w:sz w:val="48"/>
           <w:szCs w:val="48"/>
         </w:rPr>
-        <w:t xml:space="preserve"> </w:t>
+        <w:t xml:space="preserve"> 2.1,3.1.2</w:t>
       </w:r>
     </w:p>
     <w:p>
@@ -9671,8 +9671,658 @@
         <w:t>Asimismo, se considera útil incorporar un botón que permita reanudar un respaldo en caso de una interrupción inesperada, junto con la mejora de los mensajes de error para que usuarios sin conocimientos técnicos comprendan fácilmente la situación. Finalmente, se recomienda trabajar en la optimización del proceso de respaldo para hacerlo más eficiente.</w:t>
       </w:r>
     </w:p>
+    <w:p>
+      <w:pPr>
+        <w:pStyle w:val="Ttulo1"/>
+      </w:pPr>
+      <w:r>
+        <w:t>Mejoras para su implementación</w:t>
+      </w:r>
+    </w:p>
     <w:p/>
+    <w:p>
+      <w:pPr>
+        <w:pStyle w:val="Ttulo2"/>
+      </w:pPr>
+      <w:r>
+        <w:t>Interfaz de estado mejorada</w:t>
+      </w:r>
+    </w:p>
+    <w:p>
+      <w:r>
+        <w:t xml:space="preserve">Se </w:t>
+      </w:r>
+      <w:r>
+        <w:t>completará</w:t>
+      </w:r>
+      <w:r>
+        <w:t xml:space="preserve"> el sistema actual que tenemos ya que mediante a emojis tenemos por ejemplo la activación o desactivación de ciertos procesos lastimosamente debemos de implementar también por medio del texto ya que en una utilización de este sistema no se mostraron los emojis y esto puede afectar su utilización en dispositivos viejos que no detecten los emojis estos mensajes </w:t>
+      </w:r>
+      <w:r>
+        <w:t>descriptivos que permitan al usuario conocer claramente el estado del proceso</w:t>
+      </w:r>
+      <w:r>
+        <w:t xml:space="preserve"> por lo que tendremos </w:t>
+      </w:r>
+      <w:r>
+        <w:t>Indicador visual mediante emojis</w:t>
+      </w:r>
+      <w:r>
+        <w:t xml:space="preserve">, </w:t>
+      </w:r>
+      <w:r>
+        <w:t>Mensajes descriptivos del estado</w:t>
+      </w:r>
+      <w:r>
+        <w:t xml:space="preserve">, </w:t>
+      </w:r>
+      <w:r>
+        <w:t>Barra de progreso</w:t>
+      </w:r>
+      <w:r>
+        <w:t xml:space="preserve">, </w:t>
+      </w:r>
+      <w:r>
+        <w:t>Tiempo estimado restante</w:t>
+      </w:r>
+      <w:r>
+        <w:t xml:space="preserve">, </w:t>
+      </w:r>
+      <w:r>
+        <w:t xml:space="preserve">Velocidad de transferencia. </w:t>
+      </w:r>
+    </w:p>
+    <w:p>
+      <w:pPr>
+        <w:pStyle w:val="Ttulo2"/>
+      </w:pPr>
+      <w:r>
+        <w:t>Gestión Inteligente de Recursos</w:t>
+      </w:r>
+    </w:p>
+    <w:p>
+      <w:r>
+        <w:t>Detectar automáticamente los recursos del equipo para optimizar el rendimiento del respaldo sin afectar la experiencia del usuario</w:t>
+      </w:r>
+      <w:r>
+        <w:t xml:space="preserve"> para que se auto ajuste dependiendo de:</w:t>
+      </w:r>
+    </w:p>
+    <w:p>
+      <w:r>
+        <w:t>Número de procesos</w:t>
+      </w:r>
+      <w:r>
+        <w:t xml:space="preserve">, </w:t>
+      </w:r>
+      <w:r>
+        <w:t>Número de hilos</w:t>
+      </w:r>
+      <w:r>
+        <w:t>,</w:t>
+      </w:r>
+      <w:r>
+        <w:t xml:space="preserve"> Prioridad del proceso</w:t>
+      </w:r>
+      <w:r>
+        <w:t xml:space="preserve">, </w:t>
+      </w:r>
+      <w:r>
+        <w:t xml:space="preserve">Uso máximo permitido del procesador. </w:t>
+      </w:r>
+    </w:p>
+    <w:p>
+      <w:r>
+        <w:t>Sin necesidad de configuración manual.</w:t>
+      </w:r>
+    </w:p>
+    <w:p>
+      <w:pPr>
+        <w:pStyle w:val="Ttulo2"/>
+      </w:pPr>
+      <w:r>
+        <w:lastRenderedPageBreak/>
+        <w:t>Adaptación Dinámica del Rendimiento</w:t>
+      </w:r>
+    </w:p>
+    <w:p>
+      <w:r>
+        <w:t>Reducir automáticamente el consumo de recursos cuando el usuario comience a utilizar el equipo</w:t>
+      </w:r>
+      <w:r>
+        <w:t xml:space="preserve"> por lo que d</w:t>
+      </w:r>
+      <w:r>
+        <w:t>urante el respaldo el sistema supervisará continuamente:</w:t>
+      </w:r>
+    </w:p>
+    <w:p>
+      <w:r>
+        <w:t>Uso del procesador</w:t>
+      </w:r>
+      <w:r>
+        <w:t xml:space="preserve">, </w:t>
+      </w:r>
+      <w:r>
+        <w:t>Uso de memoria</w:t>
+      </w:r>
+      <w:r>
+        <w:t xml:space="preserve">, </w:t>
+      </w:r>
+      <w:r>
+        <w:t xml:space="preserve">Actividad del disco. </w:t>
+      </w:r>
+    </w:p>
+    <w:p>
+      <w:r>
+        <w:t>Si detecta una carga elevada:</w:t>
+      </w:r>
+    </w:p>
+    <w:p>
+      <w:pPr>
+        <w:numPr>
+          <w:ilvl w:val="0"/>
+          <w:numId w:val="26"/>
+        </w:numPr>
+      </w:pPr>
+      <w:r>
+        <w:t xml:space="preserve">Reducirá los hilos de copia. </w:t>
+      </w:r>
+    </w:p>
+    <w:p>
+      <w:pPr>
+        <w:numPr>
+          <w:ilvl w:val="0"/>
+          <w:numId w:val="26"/>
+        </w:numPr>
+      </w:pPr>
+      <w:r>
+        <w:t xml:space="preserve">Disminuirá la prioridad del proceso. </w:t>
+      </w:r>
+    </w:p>
+    <w:p>
+      <w:pPr>
+        <w:numPr>
+          <w:ilvl w:val="0"/>
+          <w:numId w:val="26"/>
+        </w:numPr>
+      </w:pPr>
+      <w:r>
+        <w:t xml:space="preserve">Continuará utilizando únicamente los recursos disponibles. </w:t>
+      </w:r>
+    </w:p>
+    <w:p>
+      <w:r>
+        <w:t>Cuando la carga disminuya, el sistema recuperará automáticamente su velocidad máxima.</w:t>
+      </w:r>
+    </w:p>
+    <w:p>
+      <w:pPr>
+        <w:pStyle w:val="Ttulo2"/>
+      </w:pPr>
+      <w:r>
+        <w:t>Información del Sistema</w:t>
+      </w:r>
+    </w:p>
+    <w:p>
+      <w:pPr>
+        <w:rPr>
+          <w:b/>
+          <w:bCs/>
+        </w:rPr>
+      </w:pPr>
+      <w:r>
+        <w:t>Al iniciar cada respaldo se mostrará un resumen del equipo</w:t>
+      </w:r>
+      <w:r>
+        <w:t xml:space="preserve"> la información que mostraremos será:</w:t>
+      </w:r>
+    </w:p>
+    <w:p>
+      <w:pPr>
+        <w:numPr>
+          <w:ilvl w:val="0"/>
+          <w:numId w:val="27"/>
+        </w:numPr>
+      </w:pPr>
+      <w:r>
+        <w:t xml:space="preserve">Usuario del sistema </w:t>
+      </w:r>
+    </w:p>
+    <w:p>
+      <w:pPr>
+        <w:numPr>
+          <w:ilvl w:val="0"/>
+          <w:numId w:val="27"/>
+        </w:numPr>
+      </w:pPr>
+      <w:r>
+        <w:t xml:space="preserve">Nombre del equipo </w:t>
+      </w:r>
+    </w:p>
+    <w:p>
+      <w:pPr>
+        <w:numPr>
+          <w:ilvl w:val="0"/>
+          <w:numId w:val="27"/>
+        </w:numPr>
+      </w:pPr>
+      <w:r>
+        <w:t xml:space="preserve">Sistema operativo </w:t>
+      </w:r>
+    </w:p>
+    <w:p>
+      <w:pPr>
+        <w:numPr>
+          <w:ilvl w:val="0"/>
+          <w:numId w:val="27"/>
+        </w:numPr>
+      </w:pPr>
+      <w:r>
+        <w:t xml:space="preserve">Procesador </w:t>
+      </w:r>
+    </w:p>
+    <w:p>
+      <w:pPr>
+        <w:numPr>
+          <w:ilvl w:val="0"/>
+          <w:numId w:val="27"/>
+        </w:numPr>
+      </w:pPr>
+      <w:r>
+        <w:t xml:space="preserve">Núcleos </w:t>
+      </w:r>
+    </w:p>
+    <w:p>
+      <w:pPr>
+        <w:numPr>
+          <w:ilvl w:val="0"/>
+          <w:numId w:val="27"/>
+        </w:numPr>
+      </w:pPr>
+      <w:r>
+        <w:t xml:space="preserve">Hilos </w:t>
+      </w:r>
+    </w:p>
+    <w:p>
+      <w:pPr>
+        <w:numPr>
+          <w:ilvl w:val="0"/>
+          <w:numId w:val="27"/>
+        </w:numPr>
+      </w:pPr>
+      <w:r>
+        <w:t xml:space="preserve">Memoria RAM instalada </w:t>
+      </w:r>
+    </w:p>
+    <w:p>
+      <w:pPr>
+        <w:numPr>
+          <w:ilvl w:val="0"/>
+          <w:numId w:val="27"/>
+        </w:numPr>
+      </w:pPr>
+      <w:r>
+        <w:t xml:space="preserve">Memoria RAM disponible </w:t>
+      </w:r>
+    </w:p>
+    <w:p>
+      <w:pPr>
+        <w:numPr>
+          <w:ilvl w:val="0"/>
+          <w:numId w:val="27"/>
+        </w:numPr>
+      </w:pPr>
+      <w:r>
+        <w:t xml:space="preserve">Disco origen </w:t>
+      </w:r>
+    </w:p>
+    <w:p>
+      <w:pPr>
+        <w:numPr>
+          <w:ilvl w:val="0"/>
+          <w:numId w:val="27"/>
+        </w:numPr>
+      </w:pPr>
+      <w:r>
+        <w:t xml:space="preserve">Disco destino </w:t>
+      </w:r>
+    </w:p>
+    <w:p>
+      <w:pPr>
+        <w:numPr>
+          <w:ilvl w:val="0"/>
+          <w:numId w:val="27"/>
+        </w:numPr>
+      </w:pPr>
+      <w:r>
+        <w:t xml:space="preserve">Espacio disponible </w:t>
+      </w:r>
+    </w:p>
+    <w:p>
+      <w:pPr>
+        <w:numPr>
+          <w:ilvl w:val="0"/>
+          <w:numId w:val="27"/>
+        </w:numPr>
+      </w:pPr>
+      <w:r>
+        <w:t xml:space="preserve">Versión de Respaldos.Gio </w:t>
+      </w:r>
+    </w:p>
+    <w:p>
+      <w:pPr>
+        <w:pStyle w:val="Ttulo2"/>
+      </w:pPr>
+      <w:r>
+        <w:lastRenderedPageBreak/>
+        <w:t>Identificación Inteligente de los Respaldos</w:t>
+      </w:r>
+    </w:p>
+    <w:p>
+      <w:r>
+        <w:t>Cada respaldo incluirá información suficiente para identificar su origen.</w:t>
+      </w:r>
+    </w:p>
+    <w:p>
+      <w:r>
+        <w:t>Formato propuesto</w:t>
+      </w:r>
+    </w:p>
+    <w:p>
+      <w:r>
+        <w:t>Usuario_Equipo_Fecha_Hora</w:t>
+      </w:r>
+    </w:p>
+    <w:p>
+      <w:r>
+        <w:t>Ejemplo</w:t>
+      </w:r>
+    </w:p>
+    <w:p>
+      <w:r>
+        <w:t>Oscar_ThinkPadT14_2026-07-24_15-35-10</w:t>
+      </w:r>
+    </w:p>
+    <w:p>
+      <w:r>
+        <w:t>Beneficios</w:t>
+      </w:r>
+    </w:p>
+    <w:p>
+      <w:pPr>
+        <w:numPr>
+          <w:ilvl w:val="0"/>
+          <w:numId w:val="28"/>
+        </w:numPr>
+      </w:pPr>
+      <w:r>
+        <w:t xml:space="preserve">Fácil identificación. </w:t>
+      </w:r>
+    </w:p>
+    <w:p>
+      <w:pPr>
+        <w:numPr>
+          <w:ilvl w:val="0"/>
+          <w:numId w:val="28"/>
+        </w:numPr>
+      </w:pPr>
+      <w:r>
+        <w:t xml:space="preserve">Evita sobrescribir respaldos. </w:t>
+      </w:r>
+    </w:p>
+    <w:p>
+      <w:pPr>
+        <w:numPr>
+          <w:ilvl w:val="0"/>
+          <w:numId w:val="28"/>
+        </w:numPr>
+      </w:pPr>
+      <w:r>
+        <w:t xml:space="preserve">Organización automática. </w:t>
+      </w:r>
+    </w:p>
+    <w:p>
+      <w:pPr>
+        <w:pStyle w:val="Ttulo2"/>
+      </w:pPr>
+      <w:r>
+        <w:t>Archivo de Información del Respaldo</w:t>
+      </w:r>
+    </w:p>
     <w:p/>
+    <w:p>
+      <w:r>
+        <w:t>Cada respaldo incluirá un archivo denominado:</w:t>
+      </w:r>
+    </w:p>
+    <w:p>
+      <w:r>
+        <w:t>backup_info.json</w:t>
+      </w:r>
+    </w:p>
+    <w:p>
+      <w:r>
+        <w:t>Contenido</w:t>
+      </w:r>
+    </w:p>
+    <w:p>
+      <w:r>
+        <w:t>Fecha</w:t>
+      </w:r>
+      <w:r>
+        <w:t>, h</w:t>
+      </w:r>
+      <w:r>
+        <w:t>ora</w:t>
+      </w:r>
+      <w:r>
+        <w:t>, u</w:t>
+      </w:r>
+      <w:r>
+        <w:t>suario</w:t>
+      </w:r>
+      <w:r>
+        <w:t>, e</w:t>
+      </w:r>
+      <w:r>
+        <w:t>quipo</w:t>
+      </w:r>
+      <w:r>
+        <w:t>, s</w:t>
+      </w:r>
+      <w:r>
+        <w:t>istema operativo</w:t>
+      </w:r>
+      <w:r>
+        <w:t>, p</w:t>
+      </w:r>
+      <w:r>
+        <w:t>rocesador</w:t>
+      </w:r>
+      <w:r>
+        <w:t>, m</w:t>
+      </w:r>
+      <w:r>
+        <w:t>emoria RAM</w:t>
+      </w:r>
+      <w:r>
+        <w:t>, d</w:t>
+      </w:r>
+      <w:r>
+        <w:t>isco origen</w:t>
+      </w:r>
+      <w:r>
+        <w:t>, d</w:t>
+      </w:r>
+      <w:r>
+        <w:t>isco destino</w:t>
+      </w:r>
+      <w:r>
+        <w:t>, n</w:t>
+      </w:r>
+      <w:r>
+        <w:t>úmero de archivos</w:t>
+      </w:r>
+      <w:r>
+        <w:t>, t</w:t>
+      </w:r>
+      <w:r>
+        <w:t>amaño total</w:t>
+      </w:r>
+      <w:r>
+        <w:t>, d</w:t>
+      </w:r>
+      <w:r>
+        <w:t>uración</w:t>
+      </w:r>
+      <w:r>
+        <w:t>, e</w:t>
+      </w:r>
+      <w:r>
+        <w:t>stado final</w:t>
+      </w:r>
+      <w:r>
+        <w:t>, v</w:t>
+      </w:r>
+      <w:r>
+        <w:t>ersión del programa</w:t>
+      </w:r>
+      <w:r>
+        <w:t>.</w:t>
+      </w:r>
+      <w:r>
+        <w:t xml:space="preserve"> </w:t>
+      </w:r>
+    </w:p>
+    <w:p>
+      <w:r>
+        <w:t>Este archivo permitirá realizar auditorías y facilitar la restauración de la información.</w:t>
+      </w:r>
+    </w:p>
+    <w:p>
+      <w:pPr>
+        <w:pStyle w:val="Ttulo2"/>
+      </w:pPr>
+      <w:r>
+        <w:t>Compatibilidad con Dispositivos Móviles</w:t>
+      </w:r>
+    </w:p>
+    <w:p/>
+    <w:p>
+      <w:r>
+        <w:t>Permitir realizar respaldos directamente desde dispositivos móviles compatibles.</w:t>
+      </w:r>
+    </w:p>
+    <w:p>
+      <w:r>
+        <w:t>Android</w:t>
+      </w:r>
+    </w:p>
+    <w:p>
+      <w:r>
+        <w:t>Fotografías</w:t>
+      </w:r>
+      <w:r>
+        <w:t>,</w:t>
+      </w:r>
+      <w:r>
+        <w:t xml:space="preserve"> </w:t>
+      </w:r>
+      <w:r>
+        <w:t>v</w:t>
+      </w:r>
+      <w:r>
+        <w:t>ideos</w:t>
+      </w:r>
+      <w:r>
+        <w:t>, m</w:t>
+      </w:r>
+      <w:r>
+        <w:t>úsica</w:t>
+      </w:r>
+      <w:r>
+        <w:t>, d</w:t>
+      </w:r>
+      <w:r>
+        <w:t>ocumentos</w:t>
+      </w:r>
+      <w:r>
+        <w:t>,</w:t>
+      </w:r>
+      <w:r>
+        <w:t xml:space="preserve"> </w:t>
+      </w:r>
+      <w:r>
+        <w:t>d</w:t>
+      </w:r>
+      <w:r>
+        <w:t>escargas</w:t>
+      </w:r>
+      <w:r>
+        <w:t>.</w:t>
+      </w:r>
+    </w:p>
+    <w:p>
+      <w:r>
+        <w:t>E i</w:t>
+      </w:r>
+      <w:r>
+        <w:t>ntegración con otros sistemas compatibles conforme lo permitan sus interfaces de acceso.</w:t>
+      </w:r>
+    </w:p>
+    <w:p>
+      <w:pPr>
+        <w:pStyle w:val="Ttulo2"/>
+      </w:pPr>
+      <w:r>
+        <w:lastRenderedPageBreak/>
+        <w:t>Escalabilidad Automática</w:t>
+      </w:r>
+    </w:p>
+    <w:p>
+      <w:r>
+        <w:t>Respaldos.Gio ajustará automáticamente su funcionamiento según las capacidades del equipo.</w:t>
+      </w:r>
+    </w:p>
+    <w:p>
+      <w:r>
+        <w:t>Ejemplos</w:t>
+      </w:r>
+    </w:p>
+    <w:p>
+      <w:pPr>
+        <w:numPr>
+          <w:ilvl w:val="0"/>
+          <w:numId w:val="31"/>
+        </w:numPr>
+      </w:pPr>
+      <w:r>
+        <w:t xml:space="preserve">Equipos de bajo rendimiento utilizarán menos procesos para mantener la estabilidad. </w:t>
+      </w:r>
+    </w:p>
+    <w:p>
+      <w:pPr>
+        <w:numPr>
+          <w:ilvl w:val="0"/>
+          <w:numId w:val="31"/>
+        </w:numPr>
+      </w:pPr>
+      <w:r>
+        <w:t xml:space="preserve">Equipos de alto rendimiento aprovecharán múltiples núcleos e hilos para acelerar la copia. </w:t>
+      </w:r>
+    </w:p>
+    <w:p>
+      <w:pPr>
+        <w:numPr>
+          <w:ilvl w:val="0"/>
+          <w:numId w:val="31"/>
+        </w:numPr>
+      </w:pPr>
+      <w:r>
+        <w:t xml:space="preserve">La configuración será completamente automática, evitando ajustes manuales. </w:t>
+      </w:r>
+    </w:p>
     <w:p>
       <w:pPr>
         <w:pStyle w:val="Ttulo1"/>
@@ -9860,7 +10510,6 @@
         <w:docPartUnique/>
       </w:docPartObj>
     </w:sdtPr>
-    <w:sdtEndPr/>
     <w:sdtContent>
       <w:p>
         <w:pPr>
@@ -10076,6 +10725,155 @@
 <file path=word/numbering.xml><?xml version="1.0" encoding="utf-8"?>
 <w:numbering xmlns:wpc="http://schemas.microsoft.com/office/word/2010/wordprocessingCanvas" xmlns:cx="http://schemas.microsoft.com/office/drawing/2014/chartex" xmlns:cx1="http://schemas.microsoft.com/office/drawing/2015/9/8/chartex" xmlns:cx2="http://schemas.microsoft.com/office/drawing/2015/10/21/chartex" xmlns:cx3="http://schemas.microsoft.com/office/drawing/2016/5/9/chartex" xmlns:cx4="http://schemas.microsoft.com/office/drawing/2016/5/10/chartex" xmlns:cx5="http://schemas.microsoft.com/office/drawing/2016/5/11/chartex" xmlns:cx6="http://schemas.microsoft.com/office/drawing/2016/5/12/chartex" xmlns:cx7="http://schemas.microsoft.com/office/drawing/2016/5/13/chartex" xmlns:cx8="http://schemas.microsoft.com/office/drawing/2016/5/14/chartex" xmlns:mc="http://schemas.openxmlformats.org/markup-compatibility/2006" xmlns:aink="http://schemas.microsoft.com/office/drawing/2016/ink" xmlns:am3d="http://schemas.microsoft.com/office/drawing/2017/model3d" xmlns:o="urn:schemas-microsoft-com:office:office" xmlns:oel="http://schemas.microsoft.com/office/2019/extlst" xmlns:r="http://schemas.openxmlformats.org/officeDocument/2006/relationships" xmlns:m="http://schemas.openxmlformats.org/officeDocument/2006/math" xmlns:v="urn:schemas-microsoft-com:vml" xmlns:wp14="http://schemas.microsoft.com/office/word/2010/wordprocessingDrawing" xmlns:wp="http://schemas.openxmlformats.org/drawingml/2006/wordprocessingDrawing" xmlns:w10="urn:schemas-microsoft-com:office:word" xmlns:w="http://schemas.openxmlformats.org/wordprocessingml/2006/main" xmlns:w14="http://schemas.microsoft.com/office/word/2010/wordml" xmlns:w15="http://schemas.microsoft.com/office/word/2012/wordml" xmlns:w16cex="http://schemas.microsoft.com/office/word/2018/wordml/cex" xmlns:w16cid="http://schemas.microsoft.com/office/word/2016/wordml/cid" xmlns:w16="http://schemas.microsoft.com/office/word/2018/wordml" xmlns:w16sdtdh="http://schemas.microsoft.com/office/word/2020/wordml/sdtdatahash" xmlns:w16se="http://schemas.microsoft.com/office/word/2015/wordml/symex" xmlns:wpg="http://schemas.microsoft.com/office/word/2010/wordprocessingGroup" xmlns:wpi="http://schemas.microsoft.com/office/word/2010/wordprocessingInk" xmlns:wne="http://schemas.microsoft.com/office/word/2006/wordml" xmlns:wps="http://schemas.microsoft.com/office/word/2010/wordprocessingShape" mc:Ignorable="w14 w15 w16se w16cid w16 w16cex w16sdtdh wp14">
   <w:abstractNum w:abstractNumId="0" w15:restartNumberingAfterBreak="0">
+    <w:nsid w:val="00BF609F"/>
+    <w:multiLevelType w:val="multilevel"/>
+    <w:tmpl w:val="F0BCF35C"/>
+    <w:lvl w:ilvl="0">
+      <w:start w:val="1"/>
+      <w:numFmt w:val="bullet"/>
+      <w:lvlText w:val=""/>
+      <w:lvlJc w:val="left"/>
+      <w:pPr>
+        <w:tabs>
+          <w:tab w:val="num" w:pos="720"/>
+        </w:tabs>
+        <w:ind w:left="720" w:hanging="360"/>
+      </w:pPr>
+      <w:rPr>
+        <w:rFonts w:ascii="Symbol" w:hAnsi="Symbol" w:hint="default"/>
+        <w:sz w:val="20"/>
+      </w:rPr>
+    </w:lvl>
+    <w:lvl w:ilvl="1" w:tentative="1">
+      <w:start w:val="1"/>
+      <w:numFmt w:val="bullet"/>
+      <w:lvlText w:val="o"/>
+      <w:lvlJc w:val="left"/>
+      <w:pPr>
+        <w:tabs>
+          <w:tab w:val="num" w:pos="1440"/>
+        </w:tabs>
+        <w:ind w:left="1440" w:hanging="360"/>
+      </w:pPr>
+      <w:rPr>
+        <w:rFonts w:ascii="Courier New" w:hAnsi="Courier New" w:hint="default"/>
+        <w:sz w:val="20"/>
+      </w:rPr>
+    </w:lvl>
+    <w:lvl w:ilvl="2" w:tentative="1">
+      <w:start w:val="1"/>
+      <w:numFmt w:val="bullet"/>
+      <w:lvlText w:val=""/>
+      <w:lvlJc w:val="left"/>
+      <w:pPr>
+        <w:tabs>
+          <w:tab w:val="num" w:pos="2160"/>
+        </w:tabs>
+        <w:ind w:left="2160" w:hanging="360"/>
+      </w:pPr>
+      <w:rPr>
+        <w:rFonts w:ascii="Wingdings" w:hAnsi="Wingdings" w:hint="default"/>
+        <w:sz w:val="20"/>
+      </w:rPr>
+    </w:lvl>
+    <w:lvl w:ilvl="3" w:tentative="1">
+      <w:start w:val="1"/>
+      <w:numFmt w:val="bullet"/>
+      <w:lvlText w:val=""/>
+      <w:lvlJc w:val="left"/>
+      <w:pPr>
+        <w:tabs>
+          <w:tab w:val="num" w:pos="2880"/>
+        </w:tabs>
+        <w:ind w:left="2880" w:hanging="360"/>
+      </w:pPr>
+      <w:rPr>
+        <w:rFonts w:ascii="Wingdings" w:hAnsi="Wingdings" w:hint="default"/>
+        <w:sz w:val="20"/>
+      </w:rPr>
+    </w:lvl>
+    <w:lvl w:ilvl="4" w:tentative="1">
+      <w:start w:val="1"/>
+      <w:numFmt w:val="bullet"/>
+      <w:lvlText w:val=""/>
+      <w:lvlJc w:val="left"/>
+      <w:pPr>
+        <w:tabs>
+          <w:tab w:val="num" w:pos="3600"/>
+        </w:tabs>
+        <w:ind w:left="3600" w:hanging="360"/>
+      </w:pPr>
+      <w:rPr>
+        <w:rFonts w:ascii="Wingdings" w:hAnsi="Wingdings" w:hint="default"/>
+        <w:sz w:val="20"/>
+      </w:rPr>
+    </w:lvl>
+    <w:lvl w:ilvl="5" w:tentative="1">
+      <w:start w:val="1"/>
+      <w:numFmt w:val="bullet"/>
+      <w:lvlText w:val=""/>
+      <w:lvlJc w:val="left"/>
+      <w:pPr>
+        <w:tabs>
+          <w:tab w:val="num" w:pos="4320"/>
+        </w:tabs>
+        <w:ind w:left="4320" w:hanging="360"/>
+      </w:pPr>
+      <w:rPr>
+        <w:rFonts w:ascii="Wingdings" w:hAnsi="Wingdings" w:hint="default"/>
+        <w:sz w:val="20"/>
+      </w:rPr>
+    </w:lvl>
+    <w:lvl w:ilvl="6" w:tentative="1">
+      <w:start w:val="1"/>
+      <w:numFmt w:val="bullet"/>
+      <w:lvlText w:val=""/>
+      <w:lvlJc w:val="left"/>
+      <w:pPr>
+        <w:tabs>
+          <w:tab w:val="num" w:pos="5040"/>
+        </w:tabs>
+        <w:ind w:left="5040" w:hanging="360"/>
+      </w:pPr>
+      <w:rPr>
+        <w:rFonts w:ascii="Wingdings" w:hAnsi="Wingdings" w:hint="default"/>
+        <w:sz w:val="20"/>
+      </w:rPr>
+    </w:lvl>
+    <w:lvl w:ilvl="7" w:tentative="1">
+      <w:start w:val="1"/>
+      <w:numFmt w:val="bullet"/>
+      <w:lvlText w:val=""/>
+      <w:lvlJc w:val="left"/>
+      <w:pPr>
+        <w:tabs>
+          <w:tab w:val="num" w:pos="5760"/>
+        </w:tabs>
+        <w:ind w:left="5760" w:hanging="360"/>
+      </w:pPr>
+      <w:rPr>
+        <w:rFonts w:ascii="Wingdings" w:hAnsi="Wingdings" w:hint="default"/>
+        <w:sz w:val="20"/>
+      </w:rPr>
+    </w:lvl>
+    <w:lvl w:ilvl="8" w:tentative="1">
+      <w:start w:val="1"/>
+      <w:numFmt w:val="bullet"/>
+      <w:lvlText w:val=""/>
+      <w:lvlJc w:val="left"/>
+      <w:pPr>
+        <w:tabs>
+          <w:tab w:val="num" w:pos="6480"/>
+        </w:tabs>
+        <w:ind w:left="6480" w:hanging="360"/>
+      </w:pPr>
+      <w:rPr>
+        <w:rFonts w:ascii="Wingdings" w:hAnsi="Wingdings" w:hint="default"/>
+        <w:sz w:val="20"/>
+      </w:rPr>
+    </w:lvl>
+  </w:abstractNum>
+  <w:abstractNum w:abstractNumId="1" w15:restartNumberingAfterBreak="0">
     <w:nsid w:val="12101DF2"/>
     <w:multiLevelType w:val="multilevel"/>
     <w:tmpl w:val="252C623A"/>
@@ -10224,7 +11022,156 @@
       </w:rPr>
     </w:lvl>
   </w:abstractNum>
-  <w:abstractNum w:abstractNumId="1" w15:restartNumberingAfterBreak="0">
+  <w:abstractNum w:abstractNumId="2" w15:restartNumberingAfterBreak="0">
+    <w:nsid w:val="15E22227"/>
+    <w:multiLevelType w:val="multilevel"/>
+    <w:tmpl w:val="B7A6E71C"/>
+    <w:lvl w:ilvl="0">
+      <w:start w:val="1"/>
+      <w:numFmt w:val="bullet"/>
+      <w:lvlText w:val=""/>
+      <w:lvlJc w:val="left"/>
+      <w:pPr>
+        <w:tabs>
+          <w:tab w:val="num" w:pos="720"/>
+        </w:tabs>
+        <w:ind w:left="720" w:hanging="360"/>
+      </w:pPr>
+      <w:rPr>
+        <w:rFonts w:ascii="Symbol" w:hAnsi="Symbol" w:hint="default"/>
+        <w:sz w:val="20"/>
+      </w:rPr>
+    </w:lvl>
+    <w:lvl w:ilvl="1" w:tentative="1">
+      <w:start w:val="1"/>
+      <w:numFmt w:val="bullet"/>
+      <w:lvlText w:val="o"/>
+      <w:lvlJc w:val="left"/>
+      <w:pPr>
+        <w:tabs>
+          <w:tab w:val="num" w:pos="1440"/>
+        </w:tabs>
+        <w:ind w:left="1440" w:hanging="360"/>
+      </w:pPr>
+      <w:rPr>
+        <w:rFonts w:ascii="Courier New" w:hAnsi="Courier New" w:hint="default"/>
+        <w:sz w:val="20"/>
+      </w:rPr>
+    </w:lvl>
+    <w:lvl w:ilvl="2" w:tentative="1">
+      <w:start w:val="1"/>
+      <w:numFmt w:val="bullet"/>
+      <w:lvlText w:val=""/>
+      <w:lvlJc w:val="left"/>
+      <w:pPr>
+        <w:tabs>
+          <w:tab w:val="num" w:pos="2160"/>
+        </w:tabs>
+        <w:ind w:left="2160" w:hanging="360"/>
+      </w:pPr>
+      <w:rPr>
+        <w:rFonts w:ascii="Wingdings" w:hAnsi="Wingdings" w:hint="default"/>
+        <w:sz w:val="20"/>
+      </w:rPr>
+    </w:lvl>
+    <w:lvl w:ilvl="3" w:tentative="1">
+      <w:start w:val="1"/>
+      <w:numFmt w:val="bullet"/>
+      <w:lvlText w:val=""/>
+      <w:lvlJc w:val="left"/>
+      <w:pPr>
+        <w:tabs>
+          <w:tab w:val="num" w:pos="2880"/>
+        </w:tabs>
+        <w:ind w:left="2880" w:hanging="360"/>
+      </w:pPr>
+      <w:rPr>
+        <w:rFonts w:ascii="Wingdings" w:hAnsi="Wingdings" w:hint="default"/>
+        <w:sz w:val="20"/>
+      </w:rPr>
+    </w:lvl>
+    <w:lvl w:ilvl="4" w:tentative="1">
+      <w:start w:val="1"/>
+      <w:numFmt w:val="bullet"/>
+      <w:lvlText w:val=""/>
+      <w:lvlJc w:val="left"/>
+      <w:pPr>
+        <w:tabs>
+          <w:tab w:val="num" w:pos="3600"/>
+        </w:tabs>
+        <w:ind w:left="3600" w:hanging="360"/>
+      </w:pPr>
+      <w:rPr>
+        <w:rFonts w:ascii="Wingdings" w:hAnsi="Wingdings" w:hint="default"/>
+        <w:sz w:val="20"/>
+      </w:rPr>
+    </w:lvl>
+    <w:lvl w:ilvl="5" w:tentative="1">
+      <w:start w:val="1"/>
+      <w:numFmt w:val="bullet"/>
+      <w:lvlText w:val=""/>
+      <w:lvlJc w:val="left"/>
+      <w:pPr>
+        <w:tabs>
+          <w:tab w:val="num" w:pos="4320"/>
+        </w:tabs>
+        <w:ind w:left="4320" w:hanging="360"/>
+      </w:pPr>
+      <w:rPr>
+        <w:rFonts w:ascii="Wingdings" w:hAnsi="Wingdings" w:hint="default"/>
+        <w:sz w:val="20"/>
+      </w:rPr>
+    </w:lvl>
+    <w:lvl w:ilvl="6" w:tentative="1">
+      <w:start w:val="1"/>
+      <w:numFmt w:val="bullet"/>
+      <w:lvlText w:val=""/>
+      <w:lvlJc w:val="left"/>
+      <w:pPr>
+        <w:tabs>
+          <w:tab w:val="num" w:pos="5040"/>
+        </w:tabs>
+        <w:ind w:left="5040" w:hanging="360"/>
+      </w:pPr>
+      <w:rPr>
+        <w:rFonts w:ascii="Wingdings" w:hAnsi="Wingdings" w:hint="default"/>
+        <w:sz w:val="20"/>
+      </w:rPr>
+    </w:lvl>
+    <w:lvl w:ilvl="7" w:tentative="1">
+      <w:start w:val="1"/>
+      <w:numFmt w:val="bullet"/>
+      <w:lvlText w:val=""/>
+      <w:lvlJc w:val="left"/>
+      <w:pPr>
+        <w:tabs>
+          <w:tab w:val="num" w:pos="5760"/>
+        </w:tabs>
+        <w:ind w:left="5760" w:hanging="360"/>
+      </w:pPr>
+      <w:rPr>
+        <w:rFonts w:ascii="Wingdings" w:hAnsi="Wingdings" w:hint="default"/>
+        <w:sz w:val="20"/>
+      </w:rPr>
+    </w:lvl>
+    <w:lvl w:ilvl="8" w:tentative="1">
+      <w:start w:val="1"/>
+      <w:numFmt w:val="bullet"/>
+      <w:lvlText w:val=""/>
+      <w:lvlJc w:val="left"/>
+      <w:pPr>
+        <w:tabs>
+          <w:tab w:val="num" w:pos="6480"/>
+        </w:tabs>
+        <w:ind w:left="6480" w:hanging="360"/>
+      </w:pPr>
+      <w:rPr>
+        <w:rFonts w:ascii="Wingdings" w:hAnsi="Wingdings" w:hint="default"/>
+        <w:sz w:val="20"/>
+      </w:rPr>
+    </w:lvl>
+  </w:abstractNum>
+  <w:abstractNum w:abstractNumId="3" w15:restartNumberingAfterBreak="0">
     <w:nsid w:val="174B5AD4"/>
     <w:multiLevelType w:val="multilevel"/>
     <w:tmpl w:val="2E584576"/>
@@ -10340,7 +11287,305 @@
       </w:pPr>
     </w:lvl>
   </w:abstractNum>
-  <w:abstractNum w:abstractNumId="2" w15:restartNumberingAfterBreak="0">
+  <w:abstractNum w:abstractNumId="4" w15:restartNumberingAfterBreak="0">
+    <w:nsid w:val="1C466A00"/>
+    <w:multiLevelType w:val="multilevel"/>
+    <w:tmpl w:val="B4BC3CDA"/>
+    <w:lvl w:ilvl="0">
+      <w:start w:val="1"/>
+      <w:numFmt w:val="bullet"/>
+      <w:lvlText w:val=""/>
+      <w:lvlJc w:val="left"/>
+      <w:pPr>
+        <w:tabs>
+          <w:tab w:val="num" w:pos="720"/>
+        </w:tabs>
+        <w:ind w:left="720" w:hanging="360"/>
+      </w:pPr>
+      <w:rPr>
+        <w:rFonts w:ascii="Symbol" w:hAnsi="Symbol" w:hint="default"/>
+        <w:sz w:val="20"/>
+      </w:rPr>
+    </w:lvl>
+    <w:lvl w:ilvl="1" w:tentative="1">
+      <w:start w:val="1"/>
+      <w:numFmt w:val="bullet"/>
+      <w:lvlText w:val="o"/>
+      <w:lvlJc w:val="left"/>
+      <w:pPr>
+        <w:tabs>
+          <w:tab w:val="num" w:pos="1440"/>
+        </w:tabs>
+        <w:ind w:left="1440" w:hanging="360"/>
+      </w:pPr>
+      <w:rPr>
+        <w:rFonts w:ascii="Courier New" w:hAnsi="Courier New" w:hint="default"/>
+        <w:sz w:val="20"/>
+      </w:rPr>
+    </w:lvl>
+    <w:lvl w:ilvl="2" w:tentative="1">
+      <w:start w:val="1"/>
+      <w:numFmt w:val="bullet"/>
+      <w:lvlText w:val=""/>
+      <w:lvlJc w:val="left"/>
+      <w:pPr>
+        <w:tabs>
+          <w:tab w:val="num" w:pos="2160"/>
+        </w:tabs>
+        <w:ind w:left="2160" w:hanging="360"/>
+      </w:pPr>
+      <w:rPr>
+        <w:rFonts w:ascii="Wingdings" w:hAnsi="Wingdings" w:hint="default"/>
+        <w:sz w:val="20"/>
+      </w:rPr>
+    </w:lvl>
+    <w:lvl w:ilvl="3" w:tentative="1">
+      <w:start w:val="1"/>
+      <w:numFmt w:val="bullet"/>
+      <w:lvlText w:val=""/>
+      <w:lvlJc w:val="left"/>
+      <w:pPr>
+        <w:tabs>
+          <w:tab w:val="num" w:pos="2880"/>
+        </w:tabs>
+        <w:ind w:left="2880" w:hanging="360"/>
+      </w:pPr>
+      <w:rPr>
+        <w:rFonts w:ascii="Wingdings" w:hAnsi="Wingdings" w:hint="default"/>
+        <w:sz w:val="20"/>
+      </w:rPr>
+    </w:lvl>
+    <w:lvl w:ilvl="4" w:tentative="1">
+      <w:start w:val="1"/>
+      <w:numFmt w:val="bullet"/>
+      <w:lvlText w:val=""/>
+      <w:lvlJc w:val="left"/>
+      <w:pPr>
+        <w:tabs>
+          <w:tab w:val="num" w:pos="3600"/>
+        </w:tabs>
+        <w:ind w:left="3600" w:hanging="360"/>
+      </w:pPr>
+      <w:rPr>
+        <w:rFonts w:ascii="Wingdings" w:hAnsi="Wingdings" w:hint="default"/>
+        <w:sz w:val="20"/>
+      </w:rPr>
+    </w:lvl>
+    <w:lvl w:ilvl="5" w:tentative="1">
+      <w:start w:val="1"/>
+      <w:numFmt w:val="bullet"/>
+      <w:lvlText w:val=""/>
+      <w:lvlJc w:val="left"/>
+      <w:pPr>
+        <w:tabs>
+          <w:tab w:val="num" w:pos="4320"/>
+        </w:tabs>
+        <w:ind w:left="4320" w:hanging="360"/>
+      </w:pPr>
+      <w:rPr>
+        <w:rFonts w:ascii="Wingdings" w:hAnsi="Wingdings" w:hint="default"/>
+        <w:sz w:val="20"/>
+      </w:rPr>
+    </w:lvl>
+    <w:lvl w:ilvl="6" w:tentative="1">
+      <w:start w:val="1"/>
+      <w:numFmt w:val="bullet"/>
+      <w:lvlText w:val=""/>
+      <w:lvlJc w:val="left"/>
+      <w:pPr>
+        <w:tabs>
+          <w:tab w:val="num" w:pos="5040"/>
+        </w:tabs>
+        <w:ind w:left="5040" w:hanging="360"/>
+      </w:pPr>
+      <w:rPr>
+        <w:rFonts w:ascii="Wingdings" w:hAnsi="Wingdings" w:hint="default"/>
+        <w:sz w:val="20"/>
+      </w:rPr>
+    </w:lvl>
+    <w:lvl w:ilvl="7" w:tentative="1">
+      <w:start w:val="1"/>
+      <w:numFmt w:val="bullet"/>
+      <w:lvlText w:val=""/>
+      <w:lvlJc w:val="left"/>
+      <w:pPr>
+        <w:tabs>
+          <w:tab w:val="num" w:pos="5760"/>
+        </w:tabs>
+        <w:ind w:left="5760" w:hanging="360"/>
+      </w:pPr>
+      <w:rPr>
+        <w:rFonts w:ascii="Wingdings" w:hAnsi="Wingdings" w:hint="default"/>
+        <w:sz w:val="20"/>
+      </w:rPr>
+    </w:lvl>
+    <w:lvl w:ilvl="8" w:tentative="1">
+      <w:start w:val="1"/>
+      <w:numFmt w:val="bullet"/>
+      <w:lvlText w:val=""/>
+      <w:lvlJc w:val="left"/>
+      <w:pPr>
+        <w:tabs>
+          <w:tab w:val="num" w:pos="6480"/>
+        </w:tabs>
+        <w:ind w:left="6480" w:hanging="360"/>
+      </w:pPr>
+      <w:rPr>
+        <w:rFonts w:ascii="Wingdings" w:hAnsi="Wingdings" w:hint="default"/>
+        <w:sz w:val="20"/>
+      </w:rPr>
+    </w:lvl>
+  </w:abstractNum>
+  <w:abstractNum w:abstractNumId="5" w15:restartNumberingAfterBreak="0">
+    <w:nsid w:val="1C5B781F"/>
+    <w:multiLevelType w:val="multilevel"/>
+    <w:tmpl w:val="19E82096"/>
+    <w:lvl w:ilvl="0">
+      <w:start w:val="1"/>
+      <w:numFmt w:val="bullet"/>
+      <w:lvlText w:val=""/>
+      <w:lvlJc w:val="left"/>
+      <w:pPr>
+        <w:tabs>
+          <w:tab w:val="num" w:pos="720"/>
+        </w:tabs>
+        <w:ind w:left="720" w:hanging="360"/>
+      </w:pPr>
+      <w:rPr>
+        <w:rFonts w:ascii="Symbol" w:hAnsi="Symbol" w:hint="default"/>
+        <w:sz w:val="20"/>
+      </w:rPr>
+    </w:lvl>
+    <w:lvl w:ilvl="1" w:tentative="1">
+      <w:start w:val="1"/>
+      <w:numFmt w:val="bullet"/>
+      <w:lvlText w:val="o"/>
+      <w:lvlJc w:val="left"/>
+      <w:pPr>
+        <w:tabs>
+          <w:tab w:val="num" w:pos="1440"/>
+        </w:tabs>
+        <w:ind w:left="1440" w:hanging="360"/>
+      </w:pPr>
+      <w:rPr>
+        <w:rFonts w:ascii="Courier New" w:hAnsi="Courier New" w:hint="default"/>
+        <w:sz w:val="20"/>
+      </w:rPr>
+    </w:lvl>
+    <w:lvl w:ilvl="2" w:tentative="1">
+      <w:start w:val="1"/>
+      <w:numFmt w:val="bullet"/>
+      <w:lvlText w:val=""/>
+      <w:lvlJc w:val="left"/>
+      <w:pPr>
+        <w:tabs>
+          <w:tab w:val="num" w:pos="2160"/>
+        </w:tabs>
+        <w:ind w:left="2160" w:hanging="360"/>
+      </w:pPr>
+      <w:rPr>
+        <w:rFonts w:ascii="Wingdings" w:hAnsi="Wingdings" w:hint="default"/>
+        <w:sz w:val="20"/>
+      </w:rPr>
+    </w:lvl>
+    <w:lvl w:ilvl="3" w:tentative="1">
+      <w:start w:val="1"/>
+      <w:numFmt w:val="bullet"/>
+      <w:lvlText w:val=""/>
+      <w:lvlJc w:val="left"/>
+      <w:pPr>
+        <w:tabs>
+          <w:tab w:val="num" w:pos="2880"/>
+        </w:tabs>
+        <w:ind w:left="2880" w:hanging="360"/>
+      </w:pPr>
+      <w:rPr>
+        <w:rFonts w:ascii="Wingdings" w:hAnsi="Wingdings" w:hint="default"/>
+        <w:sz w:val="20"/>
+      </w:rPr>
+    </w:lvl>
+    <w:lvl w:ilvl="4" w:tentative="1">
+      <w:start w:val="1"/>
+      <w:numFmt w:val="bullet"/>
+      <w:lvlText w:val=""/>
+      <w:lvlJc w:val="left"/>
+      <w:pPr>
+        <w:tabs>
+          <w:tab w:val="num" w:pos="3600"/>
+        </w:tabs>
+        <w:ind w:left="3600" w:hanging="360"/>
+      </w:pPr>
+      <w:rPr>
+        <w:rFonts w:ascii="Wingdings" w:hAnsi="Wingdings" w:hint="default"/>
+        <w:sz w:val="20"/>
+      </w:rPr>
+    </w:lvl>
+    <w:lvl w:ilvl="5" w:tentative="1">
+      <w:start w:val="1"/>
+      <w:numFmt w:val="bullet"/>
+      <w:lvlText w:val=""/>
+      <w:lvlJc w:val="left"/>
+      <w:pPr>
+        <w:tabs>
+          <w:tab w:val="num" w:pos="4320"/>
+        </w:tabs>
+        <w:ind w:left="4320" w:hanging="360"/>
+      </w:pPr>
+      <w:rPr>
+        <w:rFonts w:ascii="Wingdings" w:hAnsi="Wingdings" w:hint="default"/>
+        <w:sz w:val="20"/>
+      </w:rPr>
+    </w:lvl>
+    <w:lvl w:ilvl="6" w:tentative="1">
+      <w:start w:val="1"/>
+      <w:numFmt w:val="bullet"/>
+      <w:lvlText w:val=""/>
+      <w:lvlJc w:val="left"/>
+      <w:pPr>
+        <w:tabs>
+          <w:tab w:val="num" w:pos="5040"/>
+        </w:tabs>
+        <w:ind w:left="5040" w:hanging="360"/>
+      </w:pPr>
+      <w:rPr>
+        <w:rFonts w:ascii="Wingdings" w:hAnsi="Wingdings" w:hint="default"/>
+        <w:sz w:val="20"/>
+      </w:rPr>
+    </w:lvl>
+    <w:lvl w:ilvl="7" w:tentative="1">
+      <w:start w:val="1"/>
+      <w:numFmt w:val="bullet"/>
+      <w:lvlText w:val=""/>
+      <w:lvlJc w:val="left"/>
+      <w:pPr>
+        <w:tabs>
+          <w:tab w:val="num" w:pos="5760"/>
+        </w:tabs>
+        <w:ind w:left="5760" w:hanging="360"/>
+      </w:pPr>
+      <w:rPr>
+        <w:rFonts w:ascii="Wingdings" w:hAnsi="Wingdings" w:hint="default"/>
+        <w:sz w:val="20"/>
+      </w:rPr>
+    </w:lvl>
+    <w:lvl w:ilvl="8" w:tentative="1">
+      <w:start w:val="1"/>
+      <w:numFmt w:val="bullet"/>
+      <w:lvlText w:val=""/>
+      <w:lvlJc w:val="left"/>
+      <w:pPr>
+        <w:tabs>
+          <w:tab w:val="num" w:pos="6480"/>
+        </w:tabs>
+        <w:ind w:left="6480" w:hanging="360"/>
+      </w:pPr>
+      <w:rPr>
+        <w:rFonts w:ascii="Wingdings" w:hAnsi="Wingdings" w:hint="default"/>
+        <w:sz w:val="20"/>
+      </w:rPr>
+    </w:lvl>
+  </w:abstractNum>
+  <w:abstractNum w:abstractNumId="6" w15:restartNumberingAfterBreak="0">
     <w:nsid w:val="25725258"/>
     <w:multiLevelType w:val="multilevel"/>
     <w:tmpl w:val="2E584576"/>
@@ -10456,7 +11701,7 @@
       </w:pPr>
     </w:lvl>
   </w:abstractNum>
-  <w:abstractNum w:abstractNumId="3" w15:restartNumberingAfterBreak="0">
+  <w:abstractNum w:abstractNumId="7" w15:restartNumberingAfterBreak="0">
     <w:nsid w:val="2B6462D8"/>
     <w:multiLevelType w:val="multilevel"/>
     <w:tmpl w:val="886C3A14"/>
@@ -10569,7 +11814,7 @@
       </w:pPr>
     </w:lvl>
   </w:abstractNum>
-  <w:abstractNum w:abstractNumId="4" w15:restartNumberingAfterBreak="0">
+  <w:abstractNum w:abstractNumId="8" w15:restartNumberingAfterBreak="0">
     <w:nsid w:val="2C7715C7"/>
     <w:multiLevelType w:val="multilevel"/>
     <w:tmpl w:val="9F18CC80"/>
@@ -10686,7 +11931,7 @@
       </w:pPr>
     </w:lvl>
   </w:abstractNum>
-  <w:abstractNum w:abstractNumId="5" w15:restartNumberingAfterBreak="0">
+  <w:abstractNum w:abstractNumId="9" w15:restartNumberingAfterBreak="0">
     <w:nsid w:val="383622BC"/>
     <w:multiLevelType w:val="multilevel"/>
     <w:tmpl w:val="96BE7912"/>
@@ -10835,7 +12080,7 @@
       </w:rPr>
     </w:lvl>
   </w:abstractNum>
-  <w:abstractNum w:abstractNumId="6" w15:restartNumberingAfterBreak="0">
+  <w:abstractNum w:abstractNumId="10" w15:restartNumberingAfterBreak="0">
     <w:nsid w:val="38CC2977"/>
     <w:multiLevelType w:val="multilevel"/>
     <w:tmpl w:val="F5101C5E"/>
@@ -10948,7 +12193,7 @@
       </w:pPr>
     </w:lvl>
   </w:abstractNum>
-  <w:abstractNum w:abstractNumId="7" w15:restartNumberingAfterBreak="0">
+  <w:abstractNum w:abstractNumId="11" w15:restartNumberingAfterBreak="0">
     <w:nsid w:val="39F82D96"/>
     <w:multiLevelType w:val="multilevel"/>
     <w:tmpl w:val="31B2BF46"/>
@@ -11061,7 +12306,7 @@
       </w:pPr>
     </w:lvl>
   </w:abstractNum>
-  <w:abstractNum w:abstractNumId="8" w15:restartNumberingAfterBreak="0">
+  <w:abstractNum w:abstractNumId="12" w15:restartNumberingAfterBreak="0">
     <w:nsid w:val="3CE907E3"/>
     <w:multiLevelType w:val="multilevel"/>
     <w:tmpl w:val="2E584576"/>
@@ -11177,7 +12422,305 @@
       </w:pPr>
     </w:lvl>
   </w:abstractNum>
-  <w:abstractNum w:abstractNumId="9" w15:restartNumberingAfterBreak="0">
+  <w:abstractNum w:abstractNumId="13" w15:restartNumberingAfterBreak="0">
+    <w:nsid w:val="3E4F0B7D"/>
+    <w:multiLevelType w:val="multilevel"/>
+    <w:tmpl w:val="DA0CC240"/>
+    <w:lvl w:ilvl="0">
+      <w:start w:val="1"/>
+      <w:numFmt w:val="bullet"/>
+      <w:lvlText w:val=""/>
+      <w:lvlJc w:val="left"/>
+      <w:pPr>
+        <w:tabs>
+          <w:tab w:val="num" w:pos="720"/>
+        </w:tabs>
+        <w:ind w:left="720" w:hanging="360"/>
+      </w:pPr>
+      <w:rPr>
+        <w:rFonts w:ascii="Symbol" w:hAnsi="Symbol" w:hint="default"/>
+        <w:sz w:val="20"/>
+      </w:rPr>
+    </w:lvl>
+    <w:lvl w:ilvl="1" w:tentative="1">
+      <w:start w:val="1"/>
+      <w:numFmt w:val="bullet"/>
+      <w:lvlText w:val="o"/>
+      <w:lvlJc w:val="left"/>
+      <w:pPr>
+        <w:tabs>
+          <w:tab w:val="num" w:pos="1440"/>
+        </w:tabs>
+        <w:ind w:left="1440" w:hanging="360"/>
+      </w:pPr>
+      <w:rPr>
+        <w:rFonts w:ascii="Courier New" w:hAnsi="Courier New" w:hint="default"/>
+        <w:sz w:val="20"/>
+      </w:rPr>
+    </w:lvl>
+    <w:lvl w:ilvl="2" w:tentative="1">
+      <w:start w:val="1"/>
+      <w:numFmt w:val="bullet"/>
+      <w:lvlText w:val=""/>
+      <w:lvlJc w:val="left"/>
+      <w:pPr>
+        <w:tabs>
+          <w:tab w:val="num" w:pos="2160"/>
+        </w:tabs>
+        <w:ind w:left="2160" w:hanging="360"/>
+      </w:pPr>
+      <w:rPr>
+        <w:rFonts w:ascii="Wingdings" w:hAnsi="Wingdings" w:hint="default"/>
+        <w:sz w:val="20"/>
+      </w:rPr>
+    </w:lvl>
+    <w:lvl w:ilvl="3" w:tentative="1">
+      <w:start w:val="1"/>
+      <w:numFmt w:val="bullet"/>
+      <w:lvlText w:val=""/>
+      <w:lvlJc w:val="left"/>
+      <w:pPr>
+        <w:tabs>
+          <w:tab w:val="num" w:pos="2880"/>
+        </w:tabs>
+        <w:ind w:left="2880" w:hanging="360"/>
+      </w:pPr>
+      <w:rPr>
+        <w:rFonts w:ascii="Wingdings" w:hAnsi="Wingdings" w:hint="default"/>
+        <w:sz w:val="20"/>
+      </w:rPr>
+    </w:lvl>
+    <w:lvl w:ilvl="4" w:tentative="1">
+      <w:start w:val="1"/>
+      <w:numFmt w:val="bullet"/>
+      <w:lvlText w:val=""/>
+      <w:lvlJc w:val="left"/>
+      <w:pPr>
+        <w:tabs>
+          <w:tab w:val="num" w:pos="3600"/>
+        </w:tabs>
+        <w:ind w:left="3600" w:hanging="360"/>
+      </w:pPr>
+      <w:rPr>
+        <w:rFonts w:ascii="Wingdings" w:hAnsi="Wingdings" w:hint="default"/>
+        <w:sz w:val="20"/>
+      </w:rPr>
+    </w:lvl>
+    <w:lvl w:ilvl="5" w:tentative="1">
+      <w:start w:val="1"/>
+      <w:numFmt w:val="bullet"/>
+      <w:lvlText w:val=""/>
+      <w:lvlJc w:val="left"/>
+      <w:pPr>
+        <w:tabs>
+          <w:tab w:val="num" w:pos="4320"/>
+        </w:tabs>
+        <w:ind w:left="4320" w:hanging="360"/>
+      </w:pPr>
+      <w:rPr>
+        <w:rFonts w:ascii="Wingdings" w:hAnsi="Wingdings" w:hint="default"/>
+        <w:sz w:val="20"/>
+      </w:rPr>
+    </w:lvl>
+    <w:lvl w:ilvl="6" w:tentative="1">
+      <w:start w:val="1"/>
+      <w:numFmt w:val="bullet"/>
+      <w:lvlText w:val=""/>
+      <w:lvlJc w:val="left"/>
+      <w:pPr>
+        <w:tabs>
+          <w:tab w:val="num" w:pos="5040"/>
+        </w:tabs>
+        <w:ind w:left="5040" w:hanging="360"/>
+      </w:pPr>
+      <w:rPr>
+        <w:rFonts w:ascii="Wingdings" w:hAnsi="Wingdings" w:hint="default"/>
+        <w:sz w:val="20"/>
+      </w:rPr>
+    </w:lvl>
+    <w:lvl w:ilvl="7" w:tentative="1">
+      <w:start w:val="1"/>
+      <w:numFmt w:val="bullet"/>
+      <w:lvlText w:val=""/>
+      <w:lvlJc w:val="left"/>
+      <w:pPr>
+        <w:tabs>
+          <w:tab w:val="num" w:pos="5760"/>
+        </w:tabs>
+        <w:ind w:left="5760" w:hanging="360"/>
+      </w:pPr>
+      <w:rPr>
+        <w:rFonts w:ascii="Wingdings" w:hAnsi="Wingdings" w:hint="default"/>
+        <w:sz w:val="20"/>
+      </w:rPr>
+    </w:lvl>
+    <w:lvl w:ilvl="8" w:tentative="1">
+      <w:start w:val="1"/>
+      <w:numFmt w:val="bullet"/>
+      <w:lvlText w:val=""/>
+      <w:lvlJc w:val="left"/>
+      <w:pPr>
+        <w:tabs>
+          <w:tab w:val="num" w:pos="6480"/>
+        </w:tabs>
+        <w:ind w:left="6480" w:hanging="360"/>
+      </w:pPr>
+      <w:rPr>
+        <w:rFonts w:ascii="Wingdings" w:hAnsi="Wingdings" w:hint="default"/>
+        <w:sz w:val="20"/>
+      </w:rPr>
+    </w:lvl>
+  </w:abstractNum>
+  <w:abstractNum w:abstractNumId="14" w15:restartNumberingAfterBreak="0">
+    <w:nsid w:val="46A5684D"/>
+    <w:multiLevelType w:val="multilevel"/>
+    <w:tmpl w:val="45AC4416"/>
+    <w:lvl w:ilvl="0">
+      <w:start w:val="1"/>
+      <w:numFmt w:val="bullet"/>
+      <w:lvlText w:val=""/>
+      <w:lvlJc w:val="left"/>
+      <w:pPr>
+        <w:tabs>
+          <w:tab w:val="num" w:pos="720"/>
+        </w:tabs>
+        <w:ind w:left="720" w:hanging="360"/>
+      </w:pPr>
+      <w:rPr>
+        <w:rFonts w:ascii="Symbol" w:hAnsi="Symbol" w:hint="default"/>
+        <w:sz w:val="20"/>
+      </w:rPr>
+    </w:lvl>
+    <w:lvl w:ilvl="1" w:tentative="1">
+      <w:start w:val="1"/>
+      <w:numFmt w:val="bullet"/>
+      <w:lvlText w:val="o"/>
+      <w:lvlJc w:val="left"/>
+      <w:pPr>
+        <w:tabs>
+          <w:tab w:val="num" w:pos="1440"/>
+        </w:tabs>
+        <w:ind w:left="1440" w:hanging="360"/>
+      </w:pPr>
+      <w:rPr>
+        <w:rFonts w:ascii="Courier New" w:hAnsi="Courier New" w:hint="default"/>
+        <w:sz w:val="20"/>
+      </w:rPr>
+    </w:lvl>
+    <w:lvl w:ilvl="2" w:tentative="1">
+      <w:start w:val="1"/>
+      <w:numFmt w:val="bullet"/>
+      <w:lvlText w:val=""/>
+      <w:lvlJc w:val="left"/>
+      <w:pPr>
+        <w:tabs>
+          <w:tab w:val="num" w:pos="2160"/>
+        </w:tabs>
+        <w:ind w:left="2160" w:hanging="360"/>
+      </w:pPr>
+      <w:rPr>
+        <w:rFonts w:ascii="Wingdings" w:hAnsi="Wingdings" w:hint="default"/>
+        <w:sz w:val="20"/>
+      </w:rPr>
+    </w:lvl>
+    <w:lvl w:ilvl="3" w:tentative="1">
+      <w:start w:val="1"/>
+      <w:numFmt w:val="bullet"/>
+      <w:lvlText w:val=""/>
+      <w:lvlJc w:val="left"/>
+      <w:pPr>
+        <w:tabs>
+          <w:tab w:val="num" w:pos="2880"/>
+        </w:tabs>
+        <w:ind w:left="2880" w:hanging="360"/>
+      </w:pPr>
+      <w:rPr>
+        <w:rFonts w:ascii="Wingdings" w:hAnsi="Wingdings" w:hint="default"/>
+        <w:sz w:val="20"/>
+      </w:rPr>
+    </w:lvl>
+    <w:lvl w:ilvl="4" w:tentative="1">
+      <w:start w:val="1"/>
+      <w:numFmt w:val="bullet"/>
+      <w:lvlText w:val=""/>
+      <w:lvlJc w:val="left"/>
+      <w:pPr>
+        <w:tabs>
+          <w:tab w:val="num" w:pos="3600"/>
+        </w:tabs>
+        <w:ind w:left="3600" w:hanging="360"/>
+      </w:pPr>
+      <w:rPr>
+        <w:rFonts w:ascii="Wingdings" w:hAnsi="Wingdings" w:hint="default"/>
+        <w:sz w:val="20"/>
+      </w:rPr>
+    </w:lvl>
+    <w:lvl w:ilvl="5" w:tentative="1">
+      <w:start w:val="1"/>
+      <w:numFmt w:val="bullet"/>
+      <w:lvlText w:val=""/>
+      <w:lvlJc w:val="left"/>
+      <w:pPr>
+        <w:tabs>
+          <w:tab w:val="num" w:pos="4320"/>
+        </w:tabs>
+        <w:ind w:left="4320" w:hanging="360"/>
+      </w:pPr>
+      <w:rPr>
+        <w:rFonts w:ascii="Wingdings" w:hAnsi="Wingdings" w:hint="default"/>
+        <w:sz w:val="20"/>
+      </w:rPr>
+    </w:lvl>
+    <w:lvl w:ilvl="6" w:tentative="1">
+      <w:start w:val="1"/>
+      <w:numFmt w:val="bullet"/>
+      <w:lvlText w:val=""/>
+      <w:lvlJc w:val="left"/>
+      <w:pPr>
+        <w:tabs>
+          <w:tab w:val="num" w:pos="5040"/>
+        </w:tabs>
+        <w:ind w:left="5040" w:hanging="360"/>
+      </w:pPr>
+      <w:rPr>
+        <w:rFonts w:ascii="Wingdings" w:hAnsi="Wingdings" w:hint="default"/>
+        <w:sz w:val="20"/>
+      </w:rPr>
+    </w:lvl>
+    <w:lvl w:ilvl="7" w:tentative="1">
+      <w:start w:val="1"/>
+      <w:numFmt w:val="bullet"/>
+      <w:lvlText w:val=""/>
+      <w:lvlJc w:val="left"/>
+      <w:pPr>
+        <w:tabs>
+          <w:tab w:val="num" w:pos="5760"/>
+        </w:tabs>
+        <w:ind w:left="5760" w:hanging="360"/>
+      </w:pPr>
+      <w:rPr>
+        <w:rFonts w:ascii="Wingdings" w:hAnsi="Wingdings" w:hint="default"/>
+        <w:sz w:val="20"/>
+      </w:rPr>
+    </w:lvl>
+    <w:lvl w:ilvl="8" w:tentative="1">
+      <w:start w:val="1"/>
+      <w:numFmt w:val="bullet"/>
+      <w:lvlText w:val=""/>
+      <w:lvlJc w:val="left"/>
+      <w:pPr>
+        <w:tabs>
+          <w:tab w:val="num" w:pos="6480"/>
+        </w:tabs>
+        <w:ind w:left="6480" w:hanging="360"/>
+      </w:pPr>
+      <w:rPr>
+        <w:rFonts w:ascii="Wingdings" w:hAnsi="Wingdings" w:hint="default"/>
+        <w:sz w:val="20"/>
+      </w:rPr>
+    </w:lvl>
+  </w:abstractNum>
+  <w:abstractNum w:abstractNumId="15" w15:restartNumberingAfterBreak="0">
     <w:nsid w:val="484A1132"/>
     <w:multiLevelType w:val="multilevel"/>
     <w:tmpl w:val="B4C4536C"/>
@@ -11290,7 +12833,7 @@
       </w:pPr>
     </w:lvl>
   </w:abstractNum>
-  <w:abstractNum w:abstractNumId="10" w15:restartNumberingAfterBreak="0">
+  <w:abstractNum w:abstractNumId="16" w15:restartNumberingAfterBreak="0">
     <w:nsid w:val="48720402"/>
     <w:multiLevelType w:val="multilevel"/>
     <w:tmpl w:val="D146EC6E"/>
@@ -11403,7 +12946,7 @@
       </w:pPr>
     </w:lvl>
   </w:abstractNum>
-  <w:abstractNum w:abstractNumId="11" w15:restartNumberingAfterBreak="0">
+  <w:abstractNum w:abstractNumId="17" w15:restartNumberingAfterBreak="0">
     <w:nsid w:val="56E26EFF"/>
     <w:multiLevelType w:val="multilevel"/>
     <w:tmpl w:val="EE224332"/>
@@ -11552,7 +13095,7 @@
       </w:rPr>
     </w:lvl>
   </w:abstractNum>
-  <w:abstractNum w:abstractNumId="12" w15:restartNumberingAfterBreak="0">
+  <w:abstractNum w:abstractNumId="18" w15:restartNumberingAfterBreak="0">
     <w:nsid w:val="5F8A770A"/>
     <w:multiLevelType w:val="multilevel"/>
     <w:tmpl w:val="9F18CC80"/>
@@ -11669,7 +13212,7 @@
       </w:pPr>
     </w:lvl>
   </w:abstractNum>
-  <w:abstractNum w:abstractNumId="13" w15:restartNumberingAfterBreak="0">
+  <w:abstractNum w:abstractNumId="19" w15:restartNumberingAfterBreak="0">
     <w:nsid w:val="60A025A7"/>
     <w:multiLevelType w:val="multilevel"/>
     <w:tmpl w:val="6A7233D2"/>
@@ -11818,7 +13361,156 @@
       </w:rPr>
     </w:lvl>
   </w:abstractNum>
-  <w:abstractNum w:abstractNumId="14" w15:restartNumberingAfterBreak="0">
+  <w:abstractNum w:abstractNumId="20" w15:restartNumberingAfterBreak="0">
+    <w:nsid w:val="670C0239"/>
+    <w:multiLevelType w:val="multilevel"/>
+    <w:tmpl w:val="F5A20158"/>
+    <w:lvl w:ilvl="0">
+      <w:start w:val="1"/>
+      <w:numFmt w:val="bullet"/>
+      <w:lvlText w:val=""/>
+      <w:lvlJc w:val="left"/>
+      <w:pPr>
+        <w:tabs>
+          <w:tab w:val="num" w:pos="720"/>
+        </w:tabs>
+        <w:ind w:left="720" w:hanging="360"/>
+      </w:pPr>
+      <w:rPr>
+        <w:rFonts w:ascii="Symbol" w:hAnsi="Symbol" w:hint="default"/>
+        <w:sz w:val="20"/>
+      </w:rPr>
+    </w:lvl>
+    <w:lvl w:ilvl="1">
+      <w:start w:val="1"/>
+      <w:numFmt w:val="bullet"/>
+      <w:lvlText w:val="o"/>
+      <w:lvlJc w:val="left"/>
+      <w:pPr>
+        <w:tabs>
+          <w:tab w:val="num" w:pos="1440"/>
+        </w:tabs>
+        <w:ind w:left="1440" w:hanging="360"/>
+      </w:pPr>
+      <w:rPr>
+        <w:rFonts w:ascii="Courier New" w:hAnsi="Courier New" w:hint="default"/>
+        <w:sz w:val="20"/>
+      </w:rPr>
+    </w:lvl>
+    <w:lvl w:ilvl="2" w:tentative="1">
+      <w:start w:val="1"/>
+      <w:numFmt w:val="bullet"/>
+      <w:lvlText w:val=""/>
+      <w:lvlJc w:val="left"/>
+      <w:pPr>
+        <w:tabs>
+          <w:tab w:val="num" w:pos="2160"/>
+        </w:tabs>
+        <w:ind w:left="2160" w:hanging="360"/>
+      </w:pPr>
+      <w:rPr>
+        <w:rFonts w:ascii="Wingdings" w:hAnsi="Wingdings" w:hint="default"/>
+        <w:sz w:val="20"/>
+      </w:rPr>
+    </w:lvl>
+    <w:lvl w:ilvl="3" w:tentative="1">
+      <w:start w:val="1"/>
+      <w:numFmt w:val="bullet"/>
+      <w:lvlText w:val=""/>
+      <w:lvlJc w:val="left"/>
+      <w:pPr>
+        <w:tabs>
+          <w:tab w:val="num" w:pos="2880"/>
+        </w:tabs>
+        <w:ind w:left="2880" w:hanging="360"/>
+      </w:pPr>
+      <w:rPr>
+        <w:rFonts w:ascii="Wingdings" w:hAnsi="Wingdings" w:hint="default"/>
+        <w:sz w:val="20"/>
+      </w:rPr>
+    </w:lvl>
+    <w:lvl w:ilvl="4" w:tentative="1">
+      <w:start w:val="1"/>
+      <w:numFmt w:val="bullet"/>
+      <w:lvlText w:val=""/>
+      <w:lvlJc w:val="left"/>
+      <w:pPr>
+        <w:tabs>
+          <w:tab w:val="num" w:pos="3600"/>
+        </w:tabs>
+        <w:ind w:left="3600" w:hanging="360"/>
+      </w:pPr>
+      <w:rPr>
+        <w:rFonts w:ascii="Wingdings" w:hAnsi="Wingdings" w:hint="default"/>
+        <w:sz w:val="20"/>
+      </w:rPr>
+    </w:lvl>
+    <w:lvl w:ilvl="5" w:tentative="1">
+      <w:start w:val="1"/>
+      <w:numFmt w:val="bullet"/>
+      <w:lvlText w:val=""/>
+      <w:lvlJc w:val="left"/>
+      <w:pPr>
+        <w:tabs>
+          <w:tab w:val="num" w:pos="4320"/>
+        </w:tabs>
+        <w:ind w:left="4320" w:hanging="360"/>
+      </w:pPr>
+      <w:rPr>
+        <w:rFonts w:ascii="Wingdings" w:hAnsi="Wingdings" w:hint="default"/>
+        <w:sz w:val="20"/>
+      </w:rPr>
+    </w:lvl>
+    <w:lvl w:ilvl="6" w:tentative="1">
+      <w:start w:val="1"/>
+      <w:numFmt w:val="bullet"/>
+      <w:lvlText w:val=""/>
+      <w:lvlJc w:val="left"/>
+      <w:pPr>
+        <w:tabs>
+          <w:tab w:val="num" w:pos="5040"/>
+        </w:tabs>
+        <w:ind w:left="5040" w:hanging="360"/>
+      </w:pPr>
+      <w:rPr>
+        <w:rFonts w:ascii="Wingdings" w:hAnsi="Wingdings" w:hint="default"/>
+        <w:sz w:val="20"/>
+      </w:rPr>
+    </w:lvl>
+    <w:lvl w:ilvl="7" w:tentative="1">
+      <w:start w:val="1"/>
+      <w:numFmt w:val="bullet"/>
+      <w:lvlText w:val=""/>
+      <w:lvlJc w:val="left"/>
+      <w:pPr>
+        <w:tabs>
+          <w:tab w:val="num" w:pos="5760"/>
+        </w:tabs>
+        <w:ind w:left="5760" w:hanging="360"/>
+      </w:pPr>
+      <w:rPr>
+        <w:rFonts w:ascii="Wingdings" w:hAnsi="Wingdings" w:hint="default"/>
+        <w:sz w:val="20"/>
+      </w:rPr>
+    </w:lvl>
+    <w:lvl w:ilvl="8" w:tentative="1">
+      <w:start w:val="1"/>
+      <w:numFmt w:val="bullet"/>
+      <w:lvlText w:val=""/>
+      <w:lvlJc w:val="left"/>
+      <w:pPr>
+        <w:tabs>
+          <w:tab w:val="num" w:pos="6480"/>
+        </w:tabs>
+        <w:ind w:left="6480" w:hanging="360"/>
+      </w:pPr>
+      <w:rPr>
+        <w:rFonts w:ascii="Wingdings" w:hAnsi="Wingdings" w:hint="default"/>
+        <w:sz w:val="20"/>
+      </w:rPr>
+    </w:lvl>
+  </w:abstractNum>
+  <w:abstractNum w:abstractNumId="21" w15:restartNumberingAfterBreak="0">
     <w:nsid w:val="6B2F3CF0"/>
     <w:multiLevelType w:val="multilevel"/>
     <w:tmpl w:val="FDA2D918"/>
@@ -11967,7 +13659,7 @@
       </w:rPr>
     </w:lvl>
   </w:abstractNum>
-  <w:abstractNum w:abstractNumId="15" w15:restartNumberingAfterBreak="0">
+  <w:abstractNum w:abstractNumId="22" w15:restartNumberingAfterBreak="0">
     <w:nsid w:val="6DD26353"/>
     <w:multiLevelType w:val="hybridMultilevel"/>
     <w:tmpl w:val="1A4EA43E"/>
@@ -12056,7 +13748,7 @@
       </w:pPr>
     </w:lvl>
   </w:abstractNum>
-  <w:abstractNum w:abstractNumId="16" w15:restartNumberingAfterBreak="0">
+  <w:abstractNum w:abstractNumId="23" w15:restartNumberingAfterBreak="0">
     <w:nsid w:val="6F92790D"/>
     <w:multiLevelType w:val="multilevel"/>
     <w:tmpl w:val="87FC5DD4"/>
@@ -12205,7 +13897,7 @@
       </w:rPr>
     </w:lvl>
   </w:abstractNum>
-  <w:abstractNum w:abstractNumId="17" w15:restartNumberingAfterBreak="0">
+  <w:abstractNum w:abstractNumId="24" w15:restartNumberingAfterBreak="0">
     <w:nsid w:val="71176026"/>
     <w:multiLevelType w:val="multilevel"/>
     <w:tmpl w:val="CEA2D46E"/>
@@ -12354,7 +14046,156 @@
       </w:rPr>
     </w:lvl>
   </w:abstractNum>
-  <w:abstractNum w:abstractNumId="18" w15:restartNumberingAfterBreak="0">
+  <w:abstractNum w:abstractNumId="25" w15:restartNumberingAfterBreak="0">
+    <w:nsid w:val="727D665E"/>
+    <w:multiLevelType w:val="multilevel"/>
+    <w:tmpl w:val="D65AC356"/>
+    <w:lvl w:ilvl="0">
+      <w:start w:val="1"/>
+      <w:numFmt w:val="bullet"/>
+      <w:lvlText w:val=""/>
+      <w:lvlJc w:val="left"/>
+      <w:pPr>
+        <w:tabs>
+          <w:tab w:val="num" w:pos="720"/>
+        </w:tabs>
+        <w:ind w:left="720" w:hanging="360"/>
+      </w:pPr>
+      <w:rPr>
+        <w:rFonts w:ascii="Symbol" w:hAnsi="Symbol" w:hint="default"/>
+        <w:sz w:val="20"/>
+      </w:rPr>
+    </w:lvl>
+    <w:lvl w:ilvl="1" w:tentative="1">
+      <w:start w:val="1"/>
+      <w:numFmt w:val="bullet"/>
+      <w:lvlText w:val="o"/>
+      <w:lvlJc w:val="left"/>
+      <w:pPr>
+        <w:tabs>
+          <w:tab w:val="num" w:pos="1440"/>
+        </w:tabs>
+        <w:ind w:left="1440" w:hanging="360"/>
+      </w:pPr>
+      <w:rPr>
+        <w:rFonts w:ascii="Courier New" w:hAnsi="Courier New" w:hint="default"/>
+        <w:sz w:val="20"/>
+      </w:rPr>
+    </w:lvl>
+    <w:lvl w:ilvl="2" w:tentative="1">
+      <w:start w:val="1"/>
+      <w:numFmt w:val="bullet"/>
+      <w:lvlText w:val=""/>
+      <w:lvlJc w:val="left"/>
+      <w:pPr>
+        <w:tabs>
+          <w:tab w:val="num" w:pos="2160"/>
+        </w:tabs>
+        <w:ind w:left="2160" w:hanging="360"/>
+      </w:pPr>
+      <w:rPr>
+        <w:rFonts w:ascii="Wingdings" w:hAnsi="Wingdings" w:hint="default"/>
+        <w:sz w:val="20"/>
+      </w:rPr>
+    </w:lvl>
+    <w:lvl w:ilvl="3" w:tentative="1">
+      <w:start w:val="1"/>
+      <w:numFmt w:val="bullet"/>
+      <w:lvlText w:val=""/>
+      <w:lvlJc w:val="left"/>
+      <w:pPr>
+        <w:tabs>
+          <w:tab w:val="num" w:pos="2880"/>
+        </w:tabs>
+        <w:ind w:left="2880" w:hanging="360"/>
+      </w:pPr>
+      <w:rPr>
+        <w:rFonts w:ascii="Wingdings" w:hAnsi="Wingdings" w:hint="default"/>
+        <w:sz w:val="20"/>
+      </w:rPr>
+    </w:lvl>
+    <w:lvl w:ilvl="4" w:tentative="1">
+      <w:start w:val="1"/>
+      <w:numFmt w:val="bullet"/>
+      <w:lvlText w:val=""/>
+      <w:lvlJc w:val="left"/>
+      <w:pPr>
+        <w:tabs>
+          <w:tab w:val="num" w:pos="3600"/>
+        </w:tabs>
+        <w:ind w:left="3600" w:hanging="360"/>
+      </w:pPr>
+      <w:rPr>
+        <w:rFonts w:ascii="Wingdings" w:hAnsi="Wingdings" w:hint="default"/>
+        <w:sz w:val="20"/>
+      </w:rPr>
+    </w:lvl>
+    <w:lvl w:ilvl="5" w:tentative="1">
+      <w:start w:val="1"/>
+      <w:numFmt w:val="bullet"/>
+      <w:lvlText w:val=""/>
+      <w:lvlJc w:val="left"/>
+      <w:pPr>
+        <w:tabs>
+          <w:tab w:val="num" w:pos="4320"/>
+        </w:tabs>
+        <w:ind w:left="4320" w:hanging="360"/>
+      </w:pPr>
+      <w:rPr>
+        <w:rFonts w:ascii="Wingdings" w:hAnsi="Wingdings" w:hint="default"/>
+        <w:sz w:val="20"/>
+      </w:rPr>
+    </w:lvl>
+    <w:lvl w:ilvl="6" w:tentative="1">
+      <w:start w:val="1"/>
+      <w:numFmt w:val="bullet"/>
+      <w:lvlText w:val=""/>
+      <w:lvlJc w:val="left"/>
+      <w:pPr>
+        <w:tabs>
+          <w:tab w:val="num" w:pos="5040"/>
+        </w:tabs>
+        <w:ind w:left="5040" w:hanging="360"/>
+      </w:pPr>
+      <w:rPr>
+        <w:rFonts w:ascii="Wingdings" w:hAnsi="Wingdings" w:hint="default"/>
+        <w:sz w:val="20"/>
+      </w:rPr>
+    </w:lvl>
+    <w:lvl w:ilvl="7" w:tentative="1">
+      <w:start w:val="1"/>
+      <w:numFmt w:val="bullet"/>
+      <w:lvlText w:val=""/>
+      <w:lvlJc w:val="left"/>
+      <w:pPr>
+        <w:tabs>
+          <w:tab w:val="num" w:pos="5760"/>
+        </w:tabs>
+        <w:ind w:left="5760" w:hanging="360"/>
+      </w:pPr>
+      <w:rPr>
+        <w:rFonts w:ascii="Wingdings" w:hAnsi="Wingdings" w:hint="default"/>
+        <w:sz w:val="20"/>
+      </w:rPr>
+    </w:lvl>
+    <w:lvl w:ilvl="8" w:tentative="1">
+      <w:start w:val="1"/>
+      <w:numFmt w:val="bullet"/>
+      <w:lvlText w:val=""/>
+      <w:lvlJc w:val="left"/>
+      <w:pPr>
+        <w:tabs>
+          <w:tab w:val="num" w:pos="6480"/>
+        </w:tabs>
+        <w:ind w:left="6480" w:hanging="360"/>
+      </w:pPr>
+      <w:rPr>
+        <w:rFonts w:ascii="Wingdings" w:hAnsi="Wingdings" w:hint="default"/>
+        <w:sz w:val="20"/>
+      </w:rPr>
+    </w:lvl>
+  </w:abstractNum>
+  <w:abstractNum w:abstractNumId="26" w15:restartNumberingAfterBreak="0">
     <w:nsid w:val="76A0312B"/>
     <w:multiLevelType w:val="multilevel"/>
     <w:tmpl w:val="0B5ADEE0"/>
@@ -12467,7 +14308,305 @@
       </w:pPr>
     </w:lvl>
   </w:abstractNum>
-  <w:abstractNum w:abstractNumId="19" w15:restartNumberingAfterBreak="0">
+  <w:abstractNum w:abstractNumId="27" w15:restartNumberingAfterBreak="0">
+    <w:nsid w:val="788B2FF4"/>
+    <w:multiLevelType w:val="multilevel"/>
+    <w:tmpl w:val="E654C86E"/>
+    <w:lvl w:ilvl="0">
+      <w:start w:val="1"/>
+      <w:numFmt w:val="bullet"/>
+      <w:lvlText w:val=""/>
+      <w:lvlJc w:val="left"/>
+      <w:pPr>
+        <w:tabs>
+          <w:tab w:val="num" w:pos="720"/>
+        </w:tabs>
+        <w:ind w:left="720" w:hanging="360"/>
+      </w:pPr>
+      <w:rPr>
+        <w:rFonts w:ascii="Symbol" w:hAnsi="Symbol" w:hint="default"/>
+        <w:sz w:val="20"/>
+      </w:rPr>
+    </w:lvl>
+    <w:lvl w:ilvl="1" w:tentative="1">
+      <w:start w:val="1"/>
+      <w:numFmt w:val="bullet"/>
+      <w:lvlText w:val="o"/>
+      <w:lvlJc w:val="left"/>
+      <w:pPr>
+        <w:tabs>
+          <w:tab w:val="num" w:pos="1440"/>
+        </w:tabs>
+        <w:ind w:left="1440" w:hanging="360"/>
+      </w:pPr>
+      <w:rPr>
+        <w:rFonts w:ascii="Courier New" w:hAnsi="Courier New" w:hint="default"/>
+        <w:sz w:val="20"/>
+      </w:rPr>
+    </w:lvl>
+    <w:lvl w:ilvl="2" w:tentative="1">
+      <w:start w:val="1"/>
+      <w:numFmt w:val="bullet"/>
+      <w:lvlText w:val=""/>
+      <w:lvlJc w:val="left"/>
+      <w:pPr>
+        <w:tabs>
+          <w:tab w:val="num" w:pos="2160"/>
+        </w:tabs>
+        <w:ind w:left="2160" w:hanging="360"/>
+      </w:pPr>
+      <w:rPr>
+        <w:rFonts w:ascii="Wingdings" w:hAnsi="Wingdings" w:hint="default"/>
+        <w:sz w:val="20"/>
+      </w:rPr>
+    </w:lvl>
+    <w:lvl w:ilvl="3" w:tentative="1">
+      <w:start w:val="1"/>
+      <w:numFmt w:val="bullet"/>
+      <w:lvlText w:val=""/>
+      <w:lvlJc w:val="left"/>
+      <w:pPr>
+        <w:tabs>
+          <w:tab w:val="num" w:pos="2880"/>
+        </w:tabs>
+        <w:ind w:left="2880" w:hanging="360"/>
+      </w:pPr>
+      <w:rPr>
+        <w:rFonts w:ascii="Wingdings" w:hAnsi="Wingdings" w:hint="default"/>
+        <w:sz w:val="20"/>
+      </w:rPr>
+    </w:lvl>
+    <w:lvl w:ilvl="4" w:tentative="1">
+      <w:start w:val="1"/>
+      <w:numFmt w:val="bullet"/>
+      <w:lvlText w:val=""/>
+      <w:lvlJc w:val="left"/>
+      <w:pPr>
+        <w:tabs>
+          <w:tab w:val="num" w:pos="3600"/>
+        </w:tabs>
+        <w:ind w:left="3600" w:hanging="360"/>
+      </w:pPr>
+      <w:rPr>
+        <w:rFonts w:ascii="Wingdings" w:hAnsi="Wingdings" w:hint="default"/>
+        <w:sz w:val="20"/>
+      </w:rPr>
+    </w:lvl>
+    <w:lvl w:ilvl="5" w:tentative="1">
+      <w:start w:val="1"/>
+      <w:numFmt w:val="bullet"/>
+      <w:lvlText w:val=""/>
+      <w:lvlJc w:val="left"/>
+      <w:pPr>
+        <w:tabs>
+          <w:tab w:val="num" w:pos="4320"/>
+        </w:tabs>
+        <w:ind w:left="4320" w:hanging="360"/>
+      </w:pPr>
+      <w:rPr>
+        <w:rFonts w:ascii="Wingdings" w:hAnsi="Wingdings" w:hint="default"/>
+        <w:sz w:val="20"/>
+      </w:rPr>
+    </w:lvl>
+    <w:lvl w:ilvl="6" w:tentative="1">
+      <w:start w:val="1"/>
+      <w:numFmt w:val="bullet"/>
+      <w:lvlText w:val=""/>
+      <w:lvlJc w:val="left"/>
+      <w:pPr>
+        <w:tabs>
+          <w:tab w:val="num" w:pos="5040"/>
+        </w:tabs>
+        <w:ind w:left="5040" w:hanging="360"/>
+      </w:pPr>
+      <w:rPr>
+        <w:rFonts w:ascii="Wingdings" w:hAnsi="Wingdings" w:hint="default"/>
+        <w:sz w:val="20"/>
+      </w:rPr>
+    </w:lvl>
+    <w:lvl w:ilvl="7" w:tentative="1">
+      <w:start w:val="1"/>
+      <w:numFmt w:val="bullet"/>
+      <w:lvlText w:val=""/>
+      <w:lvlJc w:val="left"/>
+      <w:pPr>
+        <w:tabs>
+          <w:tab w:val="num" w:pos="5760"/>
+        </w:tabs>
+        <w:ind w:left="5760" w:hanging="360"/>
+      </w:pPr>
+      <w:rPr>
+        <w:rFonts w:ascii="Wingdings" w:hAnsi="Wingdings" w:hint="default"/>
+        <w:sz w:val="20"/>
+      </w:rPr>
+    </w:lvl>
+    <w:lvl w:ilvl="8" w:tentative="1">
+      <w:start w:val="1"/>
+      <w:numFmt w:val="bullet"/>
+      <w:lvlText w:val=""/>
+      <w:lvlJc w:val="left"/>
+      <w:pPr>
+        <w:tabs>
+          <w:tab w:val="num" w:pos="6480"/>
+        </w:tabs>
+        <w:ind w:left="6480" w:hanging="360"/>
+      </w:pPr>
+      <w:rPr>
+        <w:rFonts w:ascii="Wingdings" w:hAnsi="Wingdings" w:hint="default"/>
+        <w:sz w:val="20"/>
+      </w:rPr>
+    </w:lvl>
+  </w:abstractNum>
+  <w:abstractNum w:abstractNumId="28" w15:restartNumberingAfterBreak="0">
+    <w:nsid w:val="79050658"/>
+    <w:multiLevelType w:val="multilevel"/>
+    <w:tmpl w:val="20BAEBE4"/>
+    <w:lvl w:ilvl="0">
+      <w:start w:val="1"/>
+      <w:numFmt w:val="bullet"/>
+      <w:lvlText w:val=""/>
+      <w:lvlJc w:val="left"/>
+      <w:pPr>
+        <w:tabs>
+          <w:tab w:val="num" w:pos="720"/>
+        </w:tabs>
+        <w:ind w:left="720" w:hanging="360"/>
+      </w:pPr>
+      <w:rPr>
+        <w:rFonts w:ascii="Symbol" w:hAnsi="Symbol" w:hint="default"/>
+        <w:sz w:val="20"/>
+      </w:rPr>
+    </w:lvl>
+    <w:lvl w:ilvl="1" w:tentative="1">
+      <w:start w:val="1"/>
+      <w:numFmt w:val="bullet"/>
+      <w:lvlText w:val="o"/>
+      <w:lvlJc w:val="left"/>
+      <w:pPr>
+        <w:tabs>
+          <w:tab w:val="num" w:pos="1440"/>
+        </w:tabs>
+        <w:ind w:left="1440" w:hanging="360"/>
+      </w:pPr>
+      <w:rPr>
+        <w:rFonts w:ascii="Courier New" w:hAnsi="Courier New" w:hint="default"/>
+        <w:sz w:val="20"/>
+      </w:rPr>
+    </w:lvl>
+    <w:lvl w:ilvl="2" w:tentative="1">
+      <w:start w:val="1"/>
+      <w:numFmt w:val="bullet"/>
+      <w:lvlText w:val=""/>
+      <w:lvlJc w:val="left"/>
+      <w:pPr>
+        <w:tabs>
+          <w:tab w:val="num" w:pos="2160"/>
+        </w:tabs>
+        <w:ind w:left="2160" w:hanging="360"/>
+      </w:pPr>
+      <w:rPr>
+        <w:rFonts w:ascii="Wingdings" w:hAnsi="Wingdings" w:hint="default"/>
+        <w:sz w:val="20"/>
+      </w:rPr>
+    </w:lvl>
+    <w:lvl w:ilvl="3" w:tentative="1">
+      <w:start w:val="1"/>
+      <w:numFmt w:val="bullet"/>
+      <w:lvlText w:val=""/>
+      <w:lvlJc w:val="left"/>
+      <w:pPr>
+        <w:tabs>
+          <w:tab w:val="num" w:pos="2880"/>
+        </w:tabs>
+        <w:ind w:left="2880" w:hanging="360"/>
+      </w:pPr>
+      <w:rPr>
+        <w:rFonts w:ascii="Wingdings" w:hAnsi="Wingdings" w:hint="default"/>
+        <w:sz w:val="20"/>
+      </w:rPr>
+    </w:lvl>
+    <w:lvl w:ilvl="4" w:tentative="1">
+      <w:start w:val="1"/>
+      <w:numFmt w:val="bullet"/>
+      <w:lvlText w:val=""/>
+      <w:lvlJc w:val="left"/>
+      <w:pPr>
+        <w:tabs>
+          <w:tab w:val="num" w:pos="3600"/>
+        </w:tabs>
+        <w:ind w:left="3600" w:hanging="360"/>
+      </w:pPr>
+      <w:rPr>
+        <w:rFonts w:ascii="Wingdings" w:hAnsi="Wingdings" w:hint="default"/>
+        <w:sz w:val="20"/>
+      </w:rPr>
+    </w:lvl>
+    <w:lvl w:ilvl="5" w:tentative="1">
+      <w:start w:val="1"/>
+      <w:numFmt w:val="bullet"/>
+      <w:lvlText w:val=""/>
+      <w:lvlJc w:val="left"/>
+      <w:pPr>
+        <w:tabs>
+          <w:tab w:val="num" w:pos="4320"/>
+        </w:tabs>
+        <w:ind w:left="4320" w:hanging="360"/>
+      </w:pPr>
+      <w:rPr>
+        <w:rFonts w:ascii="Wingdings" w:hAnsi="Wingdings" w:hint="default"/>
+        <w:sz w:val="20"/>
+      </w:rPr>
+    </w:lvl>
+    <w:lvl w:ilvl="6" w:tentative="1">
+      <w:start w:val="1"/>
+      <w:numFmt w:val="bullet"/>
+      <w:lvlText w:val=""/>
+      <w:lvlJc w:val="left"/>
+      <w:pPr>
+        <w:tabs>
+          <w:tab w:val="num" w:pos="5040"/>
+        </w:tabs>
+        <w:ind w:left="5040" w:hanging="360"/>
+      </w:pPr>
+      <w:rPr>
+        <w:rFonts w:ascii="Wingdings" w:hAnsi="Wingdings" w:hint="default"/>
+        <w:sz w:val="20"/>
+      </w:rPr>
+    </w:lvl>
+    <w:lvl w:ilvl="7" w:tentative="1">
+      <w:start w:val="1"/>
+      <w:numFmt w:val="bullet"/>
+      <w:lvlText w:val=""/>
+      <w:lvlJc w:val="left"/>
+      <w:pPr>
+        <w:tabs>
+          <w:tab w:val="num" w:pos="5760"/>
+        </w:tabs>
+        <w:ind w:left="5760" w:hanging="360"/>
+      </w:pPr>
+      <w:rPr>
+        <w:rFonts w:ascii="Wingdings" w:hAnsi="Wingdings" w:hint="default"/>
+        <w:sz w:val="20"/>
+      </w:rPr>
+    </w:lvl>
+    <w:lvl w:ilvl="8" w:tentative="1">
+      <w:start w:val="1"/>
+      <w:numFmt w:val="bullet"/>
+      <w:lvlText w:val=""/>
+      <w:lvlJc w:val="left"/>
+      <w:pPr>
+        <w:tabs>
+          <w:tab w:val="num" w:pos="6480"/>
+        </w:tabs>
+        <w:ind w:left="6480" w:hanging="360"/>
+      </w:pPr>
+      <w:rPr>
+        <w:rFonts w:ascii="Wingdings" w:hAnsi="Wingdings" w:hint="default"/>
+        <w:sz w:val="20"/>
+      </w:rPr>
+    </w:lvl>
+  </w:abstractNum>
+  <w:abstractNum w:abstractNumId="29" w15:restartNumberingAfterBreak="0">
     <w:nsid w:val="7AF0175C"/>
     <w:multiLevelType w:val="multilevel"/>
     <w:tmpl w:val="92681EB6"/>
@@ -12580,7 +14719,7 @@
       </w:pPr>
     </w:lvl>
   </w:abstractNum>
-  <w:abstractNum w:abstractNumId="20" w15:restartNumberingAfterBreak="0">
+  <w:abstractNum w:abstractNumId="30" w15:restartNumberingAfterBreak="0">
     <w:nsid w:val="7E956184"/>
     <w:multiLevelType w:val="multilevel"/>
     <w:tmpl w:val="BB4E256C"/>
@@ -12729,68 +14868,250 @@
       </w:rPr>
     </w:lvl>
   </w:abstractNum>
+  <w:abstractNum w:abstractNumId="31" w15:restartNumberingAfterBreak="0">
+    <w:nsid w:val="7ECA6C74"/>
+    <w:multiLevelType w:val="multilevel"/>
+    <w:tmpl w:val="ED80FF40"/>
+    <w:lvl w:ilvl="0">
+      <w:start w:val="1"/>
+      <w:numFmt w:val="bullet"/>
+      <w:lvlText w:val=""/>
+      <w:lvlJc w:val="left"/>
+      <w:pPr>
+        <w:tabs>
+          <w:tab w:val="num" w:pos="720"/>
+        </w:tabs>
+        <w:ind w:left="720" w:hanging="360"/>
+      </w:pPr>
+      <w:rPr>
+        <w:rFonts w:ascii="Symbol" w:hAnsi="Symbol" w:hint="default"/>
+        <w:sz w:val="20"/>
+      </w:rPr>
+    </w:lvl>
+    <w:lvl w:ilvl="1" w:tentative="1">
+      <w:start w:val="1"/>
+      <w:numFmt w:val="bullet"/>
+      <w:lvlText w:val="o"/>
+      <w:lvlJc w:val="left"/>
+      <w:pPr>
+        <w:tabs>
+          <w:tab w:val="num" w:pos="1440"/>
+        </w:tabs>
+        <w:ind w:left="1440" w:hanging="360"/>
+      </w:pPr>
+      <w:rPr>
+        <w:rFonts w:ascii="Courier New" w:hAnsi="Courier New" w:hint="default"/>
+        <w:sz w:val="20"/>
+      </w:rPr>
+    </w:lvl>
+    <w:lvl w:ilvl="2" w:tentative="1">
+      <w:start w:val="1"/>
+      <w:numFmt w:val="bullet"/>
+      <w:lvlText w:val=""/>
+      <w:lvlJc w:val="left"/>
+      <w:pPr>
+        <w:tabs>
+          <w:tab w:val="num" w:pos="2160"/>
+        </w:tabs>
+        <w:ind w:left="2160" w:hanging="360"/>
+      </w:pPr>
+      <w:rPr>
+        <w:rFonts w:ascii="Wingdings" w:hAnsi="Wingdings" w:hint="default"/>
+        <w:sz w:val="20"/>
+      </w:rPr>
+    </w:lvl>
+    <w:lvl w:ilvl="3" w:tentative="1">
+      <w:start w:val="1"/>
+      <w:numFmt w:val="bullet"/>
+      <w:lvlText w:val=""/>
+      <w:lvlJc w:val="left"/>
+      <w:pPr>
+        <w:tabs>
+          <w:tab w:val="num" w:pos="2880"/>
+        </w:tabs>
+        <w:ind w:left="2880" w:hanging="360"/>
+      </w:pPr>
+      <w:rPr>
+        <w:rFonts w:ascii="Wingdings" w:hAnsi="Wingdings" w:hint="default"/>
+        <w:sz w:val="20"/>
+      </w:rPr>
+    </w:lvl>
+    <w:lvl w:ilvl="4" w:tentative="1">
+      <w:start w:val="1"/>
+      <w:numFmt w:val="bullet"/>
+      <w:lvlText w:val=""/>
+      <w:lvlJc w:val="left"/>
+      <w:pPr>
+        <w:tabs>
+          <w:tab w:val="num" w:pos="3600"/>
+        </w:tabs>
+        <w:ind w:left="3600" w:hanging="360"/>
+      </w:pPr>
+      <w:rPr>
+        <w:rFonts w:ascii="Wingdings" w:hAnsi="Wingdings" w:hint="default"/>
+        <w:sz w:val="20"/>
+      </w:rPr>
+    </w:lvl>
+    <w:lvl w:ilvl="5" w:tentative="1">
+      <w:start w:val="1"/>
+      <w:numFmt w:val="bullet"/>
+      <w:lvlText w:val=""/>
+      <w:lvlJc w:val="left"/>
+      <w:pPr>
+        <w:tabs>
+          <w:tab w:val="num" w:pos="4320"/>
+        </w:tabs>
+        <w:ind w:left="4320" w:hanging="360"/>
+      </w:pPr>
+      <w:rPr>
+        <w:rFonts w:ascii="Wingdings" w:hAnsi="Wingdings" w:hint="default"/>
+        <w:sz w:val="20"/>
+      </w:rPr>
+    </w:lvl>
+    <w:lvl w:ilvl="6" w:tentative="1">
+      <w:start w:val="1"/>
+      <w:numFmt w:val="bullet"/>
+      <w:lvlText w:val=""/>
+      <w:lvlJc w:val="left"/>
+      <w:pPr>
+        <w:tabs>
+          <w:tab w:val="num" w:pos="5040"/>
+        </w:tabs>
+        <w:ind w:left="5040" w:hanging="360"/>
+      </w:pPr>
+      <w:rPr>
+        <w:rFonts w:ascii="Wingdings" w:hAnsi="Wingdings" w:hint="default"/>
+        <w:sz w:val="20"/>
+      </w:rPr>
+    </w:lvl>
+    <w:lvl w:ilvl="7" w:tentative="1">
+      <w:start w:val="1"/>
+      <w:numFmt w:val="bullet"/>
+      <w:lvlText w:val=""/>
+      <w:lvlJc w:val="left"/>
+      <w:pPr>
+        <w:tabs>
+          <w:tab w:val="num" w:pos="5760"/>
+        </w:tabs>
+        <w:ind w:left="5760" w:hanging="360"/>
+      </w:pPr>
+      <w:rPr>
+        <w:rFonts w:ascii="Wingdings" w:hAnsi="Wingdings" w:hint="default"/>
+        <w:sz w:val="20"/>
+      </w:rPr>
+    </w:lvl>
+    <w:lvl w:ilvl="8" w:tentative="1">
+      <w:start w:val="1"/>
+      <w:numFmt w:val="bullet"/>
+      <w:lvlText w:val=""/>
+      <w:lvlJc w:val="left"/>
+      <w:pPr>
+        <w:tabs>
+          <w:tab w:val="num" w:pos="6480"/>
+        </w:tabs>
+        <w:ind w:left="6480" w:hanging="360"/>
+      </w:pPr>
+      <w:rPr>
+        <w:rFonts w:ascii="Wingdings" w:hAnsi="Wingdings" w:hint="default"/>
+        <w:sz w:val="20"/>
+      </w:rPr>
+    </w:lvl>
+  </w:abstractNum>
   <w:num w:numId="1" w16cid:durableId="1730181794">
+    <w:abstractNumId w:val="26"/>
+  </w:num>
+  <w:num w:numId="2" w16cid:durableId="90902728">
     <w:abstractNumId w:val="18"/>
   </w:num>
-  <w:num w:numId="2" w16cid:durableId="90902728">
+  <w:num w:numId="3" w16cid:durableId="975526599">
+    <w:abstractNumId w:val="8"/>
+  </w:num>
+  <w:num w:numId="4" w16cid:durableId="233203171">
+    <w:abstractNumId w:val="30"/>
+  </w:num>
+  <w:num w:numId="5" w16cid:durableId="1158687060">
+    <w:abstractNumId w:val="29"/>
+  </w:num>
+  <w:num w:numId="6" w16cid:durableId="822696884">
+    <w:abstractNumId w:val="11"/>
+  </w:num>
+  <w:num w:numId="7" w16cid:durableId="563099491">
+    <w:abstractNumId w:val="22"/>
+  </w:num>
+  <w:num w:numId="8" w16cid:durableId="341856389">
+    <w:abstractNumId w:val="6"/>
+  </w:num>
+  <w:num w:numId="9" w16cid:durableId="1017779239">
+    <w:abstractNumId w:val="3"/>
+  </w:num>
+  <w:num w:numId="10" w16cid:durableId="1201358429">
     <w:abstractNumId w:val="12"/>
   </w:num>
-  <w:num w:numId="3" w16cid:durableId="975526599">
+  <w:num w:numId="11" w16cid:durableId="1512988927">
+    <w:abstractNumId w:val="15"/>
+  </w:num>
+  <w:num w:numId="12" w16cid:durableId="334697609">
+    <w:abstractNumId w:val="21"/>
+  </w:num>
+  <w:num w:numId="13" w16cid:durableId="1960262068">
+    <w:abstractNumId w:val="1"/>
+  </w:num>
+  <w:num w:numId="14" w16cid:durableId="830608704">
+    <w:abstractNumId w:val="19"/>
+  </w:num>
+  <w:num w:numId="15" w16cid:durableId="1590695037">
+    <w:abstractNumId w:val="10"/>
+  </w:num>
+  <w:num w:numId="16" w16cid:durableId="766000948">
+    <w:abstractNumId w:val="7"/>
+  </w:num>
+  <w:num w:numId="17" w16cid:durableId="2003653574">
+    <w:abstractNumId w:val="16"/>
+  </w:num>
+  <w:num w:numId="18" w16cid:durableId="1895578831">
+    <w:abstractNumId w:val="23"/>
+  </w:num>
+  <w:num w:numId="19" w16cid:durableId="288899353">
+    <w:abstractNumId w:val="9"/>
+  </w:num>
+  <w:num w:numId="20" w16cid:durableId="602959057">
+    <w:abstractNumId w:val="17"/>
+  </w:num>
+  <w:num w:numId="21" w16cid:durableId="2141336014">
+    <w:abstractNumId w:val="24"/>
+  </w:num>
+  <w:num w:numId="22" w16cid:durableId="1865510578">
+    <w:abstractNumId w:val="2"/>
+  </w:num>
+  <w:num w:numId="23" w16cid:durableId="11809187">
+    <w:abstractNumId w:val="20"/>
+  </w:num>
+  <w:num w:numId="24" w16cid:durableId="2059890254">
+    <w:abstractNumId w:val="31"/>
+  </w:num>
+  <w:num w:numId="25" w16cid:durableId="834489905">
+    <w:abstractNumId w:val="25"/>
+  </w:num>
+  <w:num w:numId="26" w16cid:durableId="1300842830">
+    <w:abstractNumId w:val="27"/>
+  </w:num>
+  <w:num w:numId="27" w16cid:durableId="649942143">
+    <w:abstractNumId w:val="28"/>
+  </w:num>
+  <w:num w:numId="28" w16cid:durableId="1295910705">
+    <w:abstractNumId w:val="5"/>
+  </w:num>
+  <w:num w:numId="29" w16cid:durableId="2096979096">
     <w:abstractNumId w:val="4"/>
   </w:num>
-  <w:num w:numId="4" w16cid:durableId="233203171">
-    <w:abstractNumId w:val="20"/>
+  <w:num w:numId="30" w16cid:durableId="1613631850">
+    <w:abstractNumId w:val="0"/>
   </w:num>
-  <w:num w:numId="5" w16cid:durableId="1158687060">
-    <w:abstractNumId w:val="19"/>
-  </w:num>
-  <w:num w:numId="6" w16cid:durableId="822696884">
-    <w:abstractNumId w:val="7"/>
-  </w:num>
-  <w:num w:numId="7" w16cid:durableId="563099491">
-    <w:abstractNumId w:val="15"/>
-  </w:num>
-  <w:num w:numId="8" w16cid:durableId="341856389">
-    <w:abstractNumId w:val="2"/>
-  </w:num>
-  <w:num w:numId="9" w16cid:durableId="1017779239">
-    <w:abstractNumId w:val="1"/>
-  </w:num>
-  <w:num w:numId="10" w16cid:durableId="1201358429">
-    <w:abstractNumId w:val="8"/>
-  </w:num>
-  <w:num w:numId="11" w16cid:durableId="1512988927">
-    <w:abstractNumId w:val="9"/>
-  </w:num>
-  <w:num w:numId="12" w16cid:durableId="334697609">
+  <w:num w:numId="31" w16cid:durableId="1226185707">
     <w:abstractNumId w:val="14"/>
   </w:num>
-  <w:num w:numId="13" w16cid:durableId="1960262068">
-    <w:abstractNumId w:val="0"/>
-  </w:num>
-  <w:num w:numId="14" w16cid:durableId="830608704">
+  <w:num w:numId="32" w16cid:durableId="1624577855">
     <w:abstractNumId w:val="13"/>
-  </w:num>
-  <w:num w:numId="15" w16cid:durableId="1590695037">
-    <w:abstractNumId w:val="6"/>
-  </w:num>
-  <w:num w:numId="16" w16cid:durableId="766000948">
-    <w:abstractNumId w:val="3"/>
-  </w:num>
-  <w:num w:numId="17" w16cid:durableId="2003653574">
-    <w:abstractNumId w:val="10"/>
-  </w:num>
-  <w:num w:numId="18" w16cid:durableId="1895578831">
-    <w:abstractNumId w:val="16"/>
-  </w:num>
-  <w:num w:numId="19" w16cid:durableId="288899353">
-    <w:abstractNumId w:val="5"/>
-  </w:num>
-  <w:num w:numId="20" w16cid:durableId="602959057">
-    <w:abstractNumId w:val="11"/>
-  </w:num>
-  <w:num w:numId="21" w16cid:durableId="2141336014">
-    <w:abstractNumId w:val="17"/>
   </w:num>
 </w:numbering>
 </file>
@@ -13413,7 +15734,6 @@
   <w:style w:type="character" w:default="1" w:styleId="Fuentedeprrafopredeter">
     <w:name w:val="Default Paragraph Font"/>
     <w:uiPriority w:val="1"/>
-    <w:semiHidden/>
     <w:unhideWhenUsed/>
   </w:style>
   <w:style w:type="table" w:default="1" w:styleId="Tablanormal">

</xml_diff>